<commit_message>
Word : codes QR pour les vidéos
Co-Authored-By: Claude Opus 5.5 <noreply@anthropic.com>
Claude-Session: https://claude.ai/code/session_015h2h75HhBHkgwL79mLYYv1
</commit_message>
<xml_diff>
--- a/La chute libre.docx
+++ b/La chute libre.docx
@@ -7,7 +7,7 @@
         <w:pStyle w:val="Title"/>
       </w:pPr>
       <w:r>
-        <w:t xml:space="preserve">La chute libre</w:t>
+        <w:t xml:space="preserve">Résumé</w:t>
       </w:r>
     </w:p>
     <w:p>
@@ -247,13 +247,151 @@
         </w:r>
       </w:hyperlink>
     </w:p>
-    <w:bookmarkStart w:id="23" w:name="p1"/>
+    <w:bookmarkStart w:id="26" w:name="p1"/>
     <w:p>
       <w:pPr>
         <w:pStyle w:val="Heading1"/>
       </w:pPr>
       <w:r>
         <w:t xml:space="preserve">Activation des connaissances antérieures</w:t>
+      </w:r>
+    </w:p>
+    <w:tbl>
+      <w:tblPr>
+        <w:tblW w:w="5000" w:type="pct"/>
+        <w:jc w:val="start"/>
+        <w:tblBorders>
+          <w:top w:val="single" w:sz="6" w:space="0" w:color="9AA5AB"/>
+          <w:left w:val="single" w:sz="6" w:space="0" w:color="9AA5AB"/>
+          <w:bottom w:val="single" w:sz="6" w:space="0" w:color="9AA5AB"/>
+          <w:right w:val="single" w:sz="6" w:space="0" w:color="9AA5AB"/>
+        </w:tblBorders>
+      </w:tblPr>
+      <w:tblGrid>
+        <w:gridCol w:w="1900"/>
+        <w:gridCol w:w="7400"/>
+      </w:tblGrid>
+      <w:tr>
+        <w:trPr>
+          <w:cantSplit/>
+        </w:trPr>
+        <w:tc>
+          <w:tcPr>
+            <w:tcW w:w="1900" w:type="dxa"/>
+            <w:shd w:val="clear" w:color="auto" w:fill="FFFFFF"/>
+            <w:tcMar>
+              <w:top w:w="120" w:type="dxa"/>
+              <w:left w:w="120" w:type="dxa"/>
+              <w:bottom w:w="120" w:type="dxa"/>
+              <w:right w:w="120" w:type="dxa"/>
+            </w:tcMar>
+          </w:tcPr>
+          <w:p>
+            <w:pPr>
+              <w:jc w:val="left"/>
+            </w:pPr>
+            <w:r>
+              <w:rPr/>
+              <w:drawing>
+                <wp:inline>
+                  <wp:extent cx="1005840" cy="1005840"/>
+                  <wp:effectExtent b="0" l="0" r="0" t="0"/>
+                  <wp:docPr descr="Code QR de la vidéo" title="" id="21" name="Picture"/>
+                  <a:graphic>
+                    <a:graphicData uri="http://schemas.openxmlformats.org/drawingml/2006/picture">
+                      <pic:pic>
+                        <pic:nvPicPr>
+                          <pic:cNvPr descr="/tmp/tmp6ohqn6ia/qr-1.png" id="22" name="Picture"/>
+                          <pic:cNvPicPr>
+                            <a:picLocks noChangeArrowheads="1" noChangeAspect="1"/>
+                          </pic:cNvPicPr>
+                        </pic:nvPicPr>
+                        <pic:blipFill>
+                          <a:blip r:embed="rId20"/>
+                          <a:stretch>
+                            <a:fillRect/>
+                          </a:stretch>
+                        </pic:blipFill>
+                        <pic:spPr bwMode="auto">
+                          <a:xfrm>
+                            <a:off x="0" y="0"/>
+                            <a:ext cx="1005840" cy="1005840"/>
+                          </a:xfrm>
+                          <a:prstGeom prst="rect">
+                            <a:avLst/>
+                          </a:prstGeom>
+                          <a:noFill/>
+                          <a:ln w="9525">
+                            <a:noFill/>
+                            <a:headEnd/>
+                            <a:tailEnd/>
+                          </a:ln>
+                        </pic:spPr>
+                      </pic:pic>
+                    </a:graphicData>
+                  </a:graphic>
+                </wp:inline>
+              </w:drawing>
+            </w:r>
+          </w:p>
+        </w:tc>
+        <w:tc>
+          <w:tcPr>
+            <w:tcW w:w="7400" w:type="dxa"/>
+            <w:vAlign w:val="center"/>
+          </w:tcPr>
+          <w:p>
+            <w:pPr>
+              <w:jc w:val="left"/>
+            </w:pPr>
+            <w:r>
+              <w:rPr>
+                <w:bCs/>
+                <w:b/>
+              </w:rPr>
+              <w:t xml:space="preserve">▶ Vidéo : Rappelle-toi</w:t>
+            </w:r>
+          </w:p>
+          <w:p>
+            <w:pPr>
+              <w:jc w:val="left"/>
+            </w:pPr>
+            <w:r>
+              <w:t xml:space="preserve">La vidéo ne peut pas jouer dans le document Word. Scanne le code avec une tablette ou un téléphone, ou clique sur le lien :</w:t>
+            </w:r>
+          </w:p>
+          <w:p>
+            <w:pPr>
+              <w:jc w:val="left"/>
+            </w:pPr>
+            <w:hyperlink r:id="rId23">
+              <w:r>
+                <w:rPr>
+                  <w:rStyle w:val="Hyperlink"/>
+                </w:rPr>
+                <w:t xml:space="preserve">https://cdn.jsdelivr.net/gh/sckurosaki/lachutelibre@main/video/video-1.mp4</w:t>
+              </w:r>
+            </w:hyperlink>
+          </w:p>
+        </w:tc>
+      </w:tr>
+    </w:tbl>
+    <w:p/>
+    <w:p>
+      <w:pPr>
+        <w:pStyle w:val="Credit"/>
+      </w:pPr>
+      <w:r>
+        <w:t xml:space="preserve">Crédit : Créer par Anthropic Claude IA.</w:t>
+      </w:r>
+    </w:p>
+    <w:bookmarkStart w:id="24" w:name="gravité"/>
+    <w:p>
+      <w:pPr>
+        <w:pStyle w:val="Heading2"/>
+      </w:pPr>
+      <w:r>
+        <w:t xml:space="preserve">Gravité</w:t>
       </w:r>
     </w:p>
     <w:p>
@@ -261,47 +399,11 @@
         <w:pStyle w:val="FirstParagraph"/>
       </w:pPr>
       <w:r>
-        <w:t xml:space="preserve">▶ Vidéo :</w:t>
-      </w:r>
-      <w:r>
-        <w:t xml:space="preserve"> </w:t>
-      </w:r>
-      <w:hyperlink r:id="rId20">
-        <w:r>
-          <w:rPr>
-            <w:rStyle w:val="Hyperlink"/>
-          </w:rPr>
-          <w:t xml:space="preserve">regarder la vidéo en ligne</w:t>
-        </w:r>
-      </w:hyperlink>
+        <w:t xml:space="preserve">Force sans contact qui tire les objets vers le sol.</w:t>
+      </w:r>
     </w:p>
-    <w:p>
-      <w:pPr>
-        <w:pStyle w:val="BodyText"/>
-      </w:pPr>
-      <w:r>
-        <w:t xml:space="preserve">Crédit : Créer par Anthropic Claude IA.</w:t>
-      </w:r>
-    </w:p>
-    <w:bookmarkStart w:id="21" w:name="gravité"/>
-    <w:p>
-      <w:pPr>
-        <w:pStyle w:val="Heading2"/>
-      </w:pPr>
-      <w:r>
-        <w:t xml:space="preserve">Gravité</w:t>
-      </w:r>
-    </w:p>
-    <w:p>
-      <w:pPr>
-        <w:pStyle w:val="FirstParagraph"/>
-      </w:pPr>
-      <w:r>
-        <w:t xml:space="preserve">Force sans contact qui tire les objets vers le sol.</w:t>
-      </w:r>
-    </w:p>
-    <w:bookmarkEnd w:id="21"/>
-    <w:bookmarkStart w:id="22" w:name="mouvement-accéléré"/>
+    <w:bookmarkEnd w:id="24"/>
+    <w:bookmarkStart w:id="25" w:name="mouvement-accéléré"/>
     <w:p>
       <w:pPr>
         <w:pStyle w:val="Heading2"/>
@@ -596,9 +698,9 @@
       </w:tr>
     </w:tbl>
     <w:p/>
-    <w:bookmarkEnd w:id="22"/>
-    <w:bookmarkEnd w:id="23"/>
-    <w:bookmarkStart w:id="28" w:name="p2"/>
+    <w:bookmarkEnd w:id="25"/>
+    <w:bookmarkEnd w:id="26"/>
+    <w:bookmarkStart w:id="34" w:name="p2"/>
     <w:p>
       <w:pPr>
         <w:pStyle w:val="Heading1"/>
@@ -667,7 +769,7 @@
         <w:t xml:space="preserve">Expliquer que l'étude de la loi de la chute libre permet d'accroître la connaissance du monde naturel (RAS – 20 – A 1.1 sts).</w:t>
       </w:r>
     </w:p>
-    <w:bookmarkStart w:id="25" w:name="à-quoi-ça-sert"/>
+    <w:bookmarkStart w:id="31" w:name="à-quoi-ça-sert"/>
     <w:p>
       <w:pPr>
         <w:pStyle w:val="Heading2"/>
@@ -684,28 +786,130 @@
         <w:br/>
       </w:r>
     </w:p>
+    <w:tbl>
+      <w:tblPr>
+        <w:tblW w:w="5000" w:type="pct"/>
+        <w:jc w:val="start"/>
+        <w:tblBorders>
+          <w:top w:val="single" w:sz="6" w:space="0" w:color="9AA5AB"/>
+          <w:left w:val="single" w:sz="6" w:space="0" w:color="9AA5AB"/>
+          <w:bottom w:val="single" w:sz="6" w:space="0" w:color="9AA5AB"/>
+          <w:right w:val="single" w:sz="6" w:space="0" w:color="9AA5AB"/>
+        </w:tblBorders>
+      </w:tblPr>
+      <w:tblGrid>
+        <w:gridCol w:w="1900"/>
+        <w:gridCol w:w="7400"/>
+      </w:tblGrid>
+      <w:tr>
+        <w:trPr>
+          <w:cantSplit/>
+        </w:trPr>
+        <w:tc>
+          <w:tcPr>
+            <w:tcW w:w="1900" w:type="dxa"/>
+            <w:shd w:val="clear" w:color="auto" w:fill="FFFFFF"/>
+            <w:tcMar>
+              <w:top w:w="120" w:type="dxa"/>
+              <w:left w:w="120" w:type="dxa"/>
+              <w:bottom w:w="120" w:type="dxa"/>
+              <w:right w:w="120" w:type="dxa"/>
+            </w:tcMar>
+          </w:tcPr>
+          <w:p>
+            <w:pPr>
+              <w:jc w:val="left"/>
+            </w:pPr>
+            <w:r>
+              <w:rPr/>
+              <w:drawing>
+                <wp:inline>
+                  <wp:extent cx="1005840" cy="1005840"/>
+                  <wp:effectExtent b="0" l="0" r="0" t="0"/>
+                  <wp:docPr descr="Code QR de la vidéo" title="" id="28" name="Picture"/>
+                  <a:graphic>
+                    <a:graphicData uri="http://schemas.openxmlformats.org/drawingml/2006/picture">
+                      <pic:pic>
+                        <pic:nvPicPr>
+                          <pic:cNvPr descr="/tmp/tmp6ohqn6ia/qr-2.png" id="29" name="Picture"/>
+                          <pic:cNvPicPr>
+                            <a:picLocks noChangeArrowheads="1" noChangeAspect="1"/>
+                          </pic:cNvPicPr>
+                        </pic:nvPicPr>
+                        <pic:blipFill>
+                          <a:blip r:embed="rId27"/>
+                          <a:stretch>
+                            <a:fillRect/>
+                          </a:stretch>
+                        </pic:blipFill>
+                        <pic:spPr bwMode="auto">
+                          <a:xfrm>
+                            <a:off x="0" y="0"/>
+                            <a:ext cx="1005840" cy="1005840"/>
+                          </a:xfrm>
+                          <a:prstGeom prst="rect">
+                            <a:avLst/>
+                          </a:prstGeom>
+                          <a:noFill/>
+                          <a:ln w="9525">
+                            <a:noFill/>
+                            <a:headEnd/>
+                            <a:tailEnd/>
+                          </a:ln>
+                        </pic:spPr>
+                      </pic:pic>
+                    </a:graphicData>
+                  </a:graphic>
+                </wp:inline>
+              </w:drawing>
+            </w:r>
+          </w:p>
+        </w:tc>
+        <w:tc>
+          <w:tcPr>
+            <w:tcW w:w="7400" w:type="dxa"/>
+            <w:vAlign w:val="center"/>
+          </w:tcPr>
+          <w:p>
+            <w:pPr>
+              <w:jc w:val="left"/>
+            </w:pPr>
+            <w:r>
+              <w:rPr>
+                <w:bCs/>
+                <w:b/>
+              </w:rPr>
+              <w:t xml:space="preserve">▶ Vidéo : À quoi ça sert</w:t>
+            </w:r>
+          </w:p>
+          <w:p>
+            <w:pPr>
+              <w:jc w:val="left"/>
+            </w:pPr>
+            <w:r>
+              <w:t xml:space="preserve">La vidéo ne peut pas jouer dans le document Word. Scanne le code avec une tablette ou un téléphone, ou clique sur le lien :</w:t>
+            </w:r>
+          </w:p>
+          <w:p>
+            <w:pPr>
+              <w:jc w:val="left"/>
+            </w:pPr>
+            <w:hyperlink r:id="rId30">
+              <w:r>
+                <w:rPr>
+                  <w:rStyle w:val="Hyperlink"/>
+                </w:rPr>
+                <w:t xml:space="preserve">https://cdn.jsdelivr.net/gh/sckurosaki/lachutelibre@main/video/video-2.mp4</w:t>
+              </w:r>
+            </w:hyperlink>
+          </w:p>
+        </w:tc>
+      </w:tr>
+    </w:tbl>
+    <w:p/>
     <w:p>
       <w:pPr>
-        <w:pStyle w:val="BodyText"/>
-      </w:pPr>
-      <w:r>
-        <w:t xml:space="preserve">▶ Vidéo :</w:t>
-      </w:r>
-      <w:r>
-        <w:t xml:space="preserve"> </w:t>
-      </w:r>
-      <w:hyperlink r:id="rId24">
-        <w:r>
-          <w:rPr>
-            <w:rStyle w:val="Hyperlink"/>
-          </w:rPr>
-          <w:t xml:space="preserve">regarder la vidéo en ligne</w:t>
-        </w:r>
-      </w:hyperlink>
-    </w:p>
-    <w:p>
-      <w:pPr>
-        <w:pStyle w:val="BodyText"/>
+        <w:pStyle w:val="Credit"/>
       </w:pPr>
       <w:r>
         <w:t xml:space="preserve">Crédit : Créer par evanto</w:t>
@@ -763,8 +967,8 @@
         <w:t xml:space="preserve">certaines montres intelligentes possèdent des capteurs qui détectent les chutes et peuvent déclencher une alarme ou envoyer un signal d'urgence.</w:t>
       </w:r>
     </w:p>
-    <w:bookmarkEnd w:id="25"/>
-    <w:bookmarkStart w:id="26" w:name="ingénierie-et-architecture"/>
+    <w:bookmarkEnd w:id="31"/>
+    <w:bookmarkStart w:id="32" w:name="ingénierie-et-architecture"/>
     <w:p>
       <w:pPr>
         <w:pStyle w:val="Heading2"/>
@@ -839,8 +1043,8 @@
         <w:t xml:space="preserve">les systèmes de freinage d'urgence des ascenseurs sont calibrés grâce aux lois de la chute libre verticale. Si les câbles lâchent, les capteurs détectent l'accélération verticale immédiate (-9,81 m/s²) et déclenchent des freins mécaniques automatiques.</w:t>
       </w:r>
     </w:p>
-    <w:bookmarkEnd w:id="26"/>
-    <w:bookmarkStart w:id="27" w:name="loisirs-et-sensations-fortes"/>
+    <w:bookmarkEnd w:id="32"/>
+    <w:bookmarkStart w:id="33" w:name="loisirs-et-sensations-fortes"/>
     <w:p>
       <w:pPr>
         <w:pStyle w:val="Heading2"/>
@@ -908,9 +1112,9 @@
         <w:t xml:space="preserve">le début du saut est une chute libre verticale directe. La physique de la chute libre permet de calculer précisément la longueur maximale que l'élastique atteindra avant de se tendre, garantissant que le sauteur ne touche pas le sol.</w:t>
       </w:r>
     </w:p>
-    <w:bookmarkEnd w:id="27"/>
-    <w:bookmarkEnd w:id="28"/>
-    <w:bookmarkStart w:id="33" w:name="p3"/>
+    <w:bookmarkEnd w:id="33"/>
+    <w:bookmarkEnd w:id="34"/>
+    <w:bookmarkStart w:id="45" w:name="p3"/>
     <w:p>
       <w:pPr>
         <w:pStyle w:val="Heading1"/>
@@ -947,40 +1151,160 @@
         <w:t xml:space="preserve">Regarde la vidéo ci-dessous pour comprendre cette démarche scientifique.</w:t>
       </w:r>
     </w:p>
+    <w:tbl>
+      <w:tblPr>
+        <w:tblW w:w="5000" w:type="pct"/>
+        <w:jc w:val="start"/>
+        <w:tblBorders>
+          <w:top w:val="single" w:sz="6" w:space="0" w:color="9AA5AB"/>
+          <w:left w:val="single" w:sz="6" w:space="0" w:color="9AA5AB"/>
+          <w:bottom w:val="single" w:sz="6" w:space="0" w:color="9AA5AB"/>
+          <w:right w:val="single" w:sz="6" w:space="0" w:color="9AA5AB"/>
+        </w:tblBorders>
+      </w:tblPr>
+      <w:tblGrid>
+        <w:gridCol w:w="1900"/>
+        <w:gridCol w:w="7400"/>
+      </w:tblGrid>
+      <w:tr>
+        <w:trPr>
+          <w:cantSplit/>
+        </w:trPr>
+        <w:tc>
+          <w:tcPr>
+            <w:tcW w:w="1900" w:type="dxa"/>
+            <w:shd w:val="clear" w:color="auto" w:fill="FFFFFF"/>
+            <w:tcMar>
+              <w:top w:w="120" w:type="dxa"/>
+              <w:left w:w="120" w:type="dxa"/>
+              <w:bottom w:w="120" w:type="dxa"/>
+              <w:right w:w="120" w:type="dxa"/>
+            </w:tcMar>
+          </w:tcPr>
+          <w:p>
+            <w:pPr>
+              <w:jc w:val="left"/>
+            </w:pPr>
+            <w:r>
+              <w:rPr/>
+              <w:drawing>
+                <wp:inline>
+                  <wp:extent cx="1005840" cy="1005840"/>
+                  <wp:effectExtent b="0" l="0" r="0" t="0"/>
+                  <wp:docPr descr="Code QR de la vidéo" title="" id="36" name="Picture"/>
+                  <a:graphic>
+                    <a:graphicData uri="http://schemas.openxmlformats.org/drawingml/2006/picture">
+                      <pic:pic>
+                        <pic:nvPicPr>
+                          <pic:cNvPr descr="/tmp/tmp6ohqn6ia/qr-3.png" id="37" name="Picture"/>
+                          <pic:cNvPicPr>
+                            <a:picLocks noChangeArrowheads="1" noChangeAspect="1"/>
+                          </pic:cNvPicPr>
+                        </pic:nvPicPr>
+                        <pic:blipFill>
+                          <a:blip r:embed="rId35"/>
+                          <a:stretch>
+                            <a:fillRect/>
+                          </a:stretch>
+                        </pic:blipFill>
+                        <pic:spPr bwMode="auto">
+                          <a:xfrm>
+                            <a:off x="0" y="0"/>
+                            <a:ext cx="1005840" cy="1005840"/>
+                          </a:xfrm>
+                          <a:prstGeom prst="rect">
+                            <a:avLst/>
+                          </a:prstGeom>
+                          <a:noFill/>
+                          <a:ln w="9525">
+                            <a:noFill/>
+                            <a:headEnd/>
+                            <a:tailEnd/>
+                          </a:ln>
+                        </pic:spPr>
+                      </pic:pic>
+                    </a:graphicData>
+                  </a:graphic>
+                </wp:inline>
+              </w:drawing>
+            </w:r>
+          </w:p>
+        </w:tc>
+        <w:tc>
+          <w:tcPr>
+            <w:tcW w:w="7400" w:type="dxa"/>
+            <w:vAlign w:val="center"/>
+          </w:tcPr>
+          <w:p>
+            <w:pPr>
+              <w:jc w:val="left"/>
+            </w:pPr>
+            <w:r>
+              <w:rPr>
+                <w:bCs/>
+                <w:b/>
+              </w:rPr>
+              <w:t xml:space="preserve">▶ Vidéo : D'Aristote à Galilée</w:t>
+            </w:r>
+          </w:p>
+          <w:p>
+            <w:pPr>
+              <w:jc w:val="left"/>
+            </w:pPr>
+            <w:r>
+              <w:t xml:space="preserve">La vidéo ne peut pas jouer dans le document Word. Scanne le code avec une tablette ou un téléphone, ou clique sur le lien :</w:t>
+            </w:r>
+          </w:p>
+          <w:p>
+            <w:pPr>
+              <w:jc w:val="left"/>
+            </w:pPr>
+            <w:hyperlink r:id="rId38">
+              <w:r>
+                <w:rPr>
+                  <w:rStyle w:val="Hyperlink"/>
+                </w:rPr>
+                <w:t xml:space="preserve">https://cdn.jsdelivr.net/gh/sckurosaki/lachutelibre@main/video/video-3.mp4</w:t>
+              </w:r>
+            </w:hyperlink>
+          </w:p>
+        </w:tc>
+      </w:tr>
+    </w:tbl>
+    <w:p/>
     <w:p>
       <w:pPr>
-        <w:pStyle w:val="BodyText"/>
-      </w:pPr>
-      <w:r>
-        <w:t xml:space="preserve">▶ Vidéo :</w:t>
-      </w:r>
-      <w:r>
-        <w:t xml:space="preserve"> </w:t>
-      </w:r>
-      <w:hyperlink r:id="rId29">
-        <w:r>
-          <w:rPr>
-            <w:rStyle w:val="Hyperlink"/>
-          </w:rPr>
-          <w:t xml:space="preserve">regarder la vidéo en ligne</w:t>
-        </w:r>
-      </w:hyperlink>
+        <w:pStyle w:val="Credit"/>
+      </w:pPr>
+      <w:r>
+        <w:t xml:space="preserve">Crédit : créée par Elevenlabs.</w:t>
+      </w:r>
+    </w:p>
+    <w:bookmarkStart w:id="39" w:name="Xb68569cb48527f8bd6ed7c6f9b3cf5a64d59e70"/>
+    <w:p>
+      <w:pPr>
+        <w:pStyle w:val="Heading2"/>
+      </w:pPr>
+      <w:r>
+        <w:t xml:space="preserve">La théorie de Galilée sur les objets en chute libre</w:t>
+      </w:r>
     </w:p>
     <w:p>
       <w:pPr>
-        <w:pStyle w:val="BodyText"/>
-      </w:pPr>
-      <w:r>
-        <w:t xml:space="preserve">Crédit : créée par Elevenlabs.</w:t>
+        <w:pStyle w:val="FirstParagraph"/>
+      </w:pPr>
+      <w:r>
+        <w:t xml:space="preserve">Il est vrai que des objets différents ne subissent pas la même accélération lorsqu'ils tombent, mais si nous négligeons la résistance de l'air, ils atteindront le sol en même temps. Galilée réfuta donc l'idée d'Aristote : si l'on néglige la résistance de l'air, un objet dont la masse est 10 fois plus grande que celle d'un autre ne tombera pas 10 fois plus vite.</w:t>
       </w:r>
     </w:p>
-    <w:bookmarkStart w:id="30" w:name="Xb68569cb48527f8bd6ed7c6f9b3cf5a64d59e70"/>
+    <w:bookmarkEnd w:id="39"/>
+    <w:bookmarkStart w:id="44" w:name="preuve-dans-le-vide"/>
     <w:p>
       <w:pPr>
         <w:pStyle w:val="Heading2"/>
       </w:pPr>
       <w:r>
-        <w:t xml:space="preserve">La théorie de Galilée sur les objets en chute libre</w:t>
+        <w:t xml:space="preserve">Preuve dans le vide</w:t>
       </w:r>
     </w:p>
     <w:p>
@@ -988,25 +1312,15 @@
         <w:pStyle w:val="FirstParagraph"/>
       </w:pPr>
       <w:r>
-        <w:t xml:space="preserve">Il est vrai que des objets différents ne subissent pas la même accélération lorsqu'ils tombent, mais si nous négligeons la résistance de l'air, ils atteindront le sol en même temps. Galilée réfuta donc l'idée d'Aristote : si l'on néglige la résistance de l'air, un objet dont la masse est 10 fois plus grande que celle d'un autre ne tombera pas 10 fois plus vite.</w:t>
-      </w:r>
-    </w:p>
-    <w:bookmarkEnd w:id="30"/>
-    <w:bookmarkStart w:id="32" w:name="preuve-dans-le-vide"/>
-    <w:p>
-      <w:pPr>
-        <w:pStyle w:val="Heading2"/>
-      </w:pPr>
-      <w:r>
-        <w:t xml:space="preserve">Preuve dans le vide</w:t>
+        <w:t xml:space="preserve">Cette loi de la chute libre est très difficile à démontrer, à moins qu'on ne soit capable de faire le vide. Connais-tu un endroit où il n'y a pas d'air, c'est-à-dire le vide? L'espace!</w:t>
       </w:r>
     </w:p>
     <w:p>
       <w:pPr>
-        <w:pStyle w:val="FirstParagraph"/>
-      </w:pPr>
-      <w:r>
-        <w:t xml:space="preserve">Cette loi de la chute libre est très difficile à démontrer, à moins qu'on ne soit capable de faire le vide. Connais-tu un endroit où il n'y a pas d'air, c'est-à-dire le vide? L'espace!</w:t>
+        <w:pStyle w:val="BodyText"/>
+      </w:pPr>
+      <w:r>
+        <w:t xml:space="preserve">En 1971, lors de la mission Apollo 15, l'astronaute David Scott a lâché simultanément un marteau de géologue et une plume de faucon. Il a donc fallu aller sur la Lune pour valider la théorie de Galilée.</w:t>
       </w:r>
     </w:p>
     <w:p>
@@ -1014,7 +1328,136 @@
         <w:pStyle w:val="BodyText"/>
       </w:pPr>
       <w:r>
-        <w:t xml:space="preserve">En 1971, lors de la mission Apollo 15, l'astronaute David Scott a lâché simultanément un marteau de géologue et une plume de faucon. Il a donc fallu aller sur la Lune pour valider la théorie de Galilée.</w:t>
+        <w:t xml:space="preserve">Regarde la vidéo suivante et choisis les sous-titres en français.</w:t>
+      </w:r>
+    </w:p>
+    <w:tbl>
+      <w:tblPr>
+        <w:tblW w:w="5000" w:type="pct"/>
+        <w:jc w:val="start"/>
+        <w:tblBorders>
+          <w:top w:val="single" w:sz="6" w:space="0" w:color="9AA5AB"/>
+          <w:left w:val="single" w:sz="6" w:space="0" w:color="9AA5AB"/>
+          <w:bottom w:val="single" w:sz="6" w:space="0" w:color="9AA5AB"/>
+          <w:right w:val="single" w:sz="6" w:space="0" w:color="9AA5AB"/>
+        </w:tblBorders>
+      </w:tblPr>
+      <w:tblGrid>
+        <w:gridCol w:w="1900"/>
+        <w:gridCol w:w="7400"/>
+      </w:tblGrid>
+      <w:tr>
+        <w:trPr>
+          <w:cantSplit/>
+        </w:trPr>
+        <w:tc>
+          <w:tcPr>
+            <w:tcW w:w="1900" w:type="dxa"/>
+            <w:shd w:val="clear" w:color="auto" w:fill="FFFFFF"/>
+            <w:tcMar>
+              <w:top w:w="120" w:type="dxa"/>
+              <w:left w:w="120" w:type="dxa"/>
+              <w:bottom w:w="120" w:type="dxa"/>
+              <w:right w:w="120" w:type="dxa"/>
+            </w:tcMar>
+          </w:tcPr>
+          <w:p>
+            <w:pPr>
+              <w:jc w:val="left"/>
+            </w:pPr>
+            <w:r>
+              <w:rPr/>
+              <w:drawing>
+                <wp:inline>
+                  <wp:extent cx="1005840" cy="1005840"/>
+                  <wp:effectExtent b="0" l="0" r="0" t="0"/>
+                  <wp:docPr descr="Code QR de la vidéo" title="" id="41" name="Picture"/>
+                  <a:graphic>
+                    <a:graphicData uri="http://schemas.openxmlformats.org/drawingml/2006/picture">
+                      <pic:pic>
+                        <pic:nvPicPr>
+                          <pic:cNvPr descr="/tmp/tmp6ohqn6ia/qr-4.png" id="42" name="Picture"/>
+                          <pic:cNvPicPr>
+                            <a:picLocks noChangeArrowheads="1" noChangeAspect="1"/>
+                          </pic:cNvPicPr>
+                        </pic:nvPicPr>
+                        <pic:blipFill>
+                          <a:blip r:embed="rId40"/>
+                          <a:stretch>
+                            <a:fillRect/>
+                          </a:stretch>
+                        </pic:blipFill>
+                        <pic:spPr bwMode="auto">
+                          <a:xfrm>
+                            <a:off x="0" y="0"/>
+                            <a:ext cx="1005840" cy="1005840"/>
+                          </a:xfrm>
+                          <a:prstGeom prst="rect">
+                            <a:avLst/>
+                          </a:prstGeom>
+                          <a:noFill/>
+                          <a:ln w="9525">
+                            <a:noFill/>
+                            <a:headEnd/>
+                            <a:tailEnd/>
+                          </a:ln>
+                        </pic:spPr>
+                      </pic:pic>
+                    </a:graphicData>
+                  </a:graphic>
+                </wp:inline>
+              </w:drawing>
+            </w:r>
+          </w:p>
+        </w:tc>
+        <w:tc>
+          <w:tcPr>
+            <w:tcW w:w="7400" w:type="dxa"/>
+            <w:vAlign w:val="center"/>
+          </w:tcPr>
+          <w:p>
+            <w:pPr>
+              <w:jc w:val="left"/>
+            </w:pPr>
+            <w:r>
+              <w:rPr>
+                <w:bCs/>
+                <w:b/>
+              </w:rPr>
+              <w:t xml:space="preserve">▶ Vidéo</w:t>
+            </w:r>
+          </w:p>
+          <w:p>
+            <w:pPr>
+              <w:jc w:val="left"/>
+            </w:pPr>
+            <w:r>
+              <w:t xml:space="preserve">La vidéo ne peut pas jouer dans le document Word. Scanne le code avec une tablette ou un téléphone, ou clique sur le lien :</w:t>
+            </w:r>
+          </w:p>
+          <w:p>
+            <w:pPr>
+              <w:jc w:val="left"/>
+            </w:pPr>
+            <w:hyperlink r:id="rId43">
+              <w:r>
+                <w:rPr>
+                  <w:rStyle w:val="Hyperlink"/>
+                </w:rPr>
+                <w:t xml:space="preserve">https://commons.wikimedia.org/wiki/File:Apollo_15_feather_and_hammer_drop.ogv?embedplayer=yes</w:t>
+              </w:r>
+            </w:hyperlink>
+          </w:p>
+        </w:tc>
+      </w:tr>
+    </w:tbl>
+    <w:p/>
+    <w:p>
+      <w:pPr>
+        <w:pStyle w:val="Credit"/>
+      </w:pPr>
+      <w:r>
+        <w:t xml:space="preserve">Crédit : Wikimedia Commons Voir la source</w:t>
       </w:r>
     </w:p>
     <w:p>
@@ -1022,47 +1465,12 @@
         <w:pStyle w:val="BodyText"/>
       </w:pPr>
       <w:r>
-        <w:t xml:space="preserve">Regarde la vidéo suivante et choisis les sous-titres en français.</w:t>
+        <w:t xml:space="preserve">L'étude de la chute libre représente l'un des plus grands bouleversements de l'histoire des sciences, marquant le passage d'une philosophie qualitative et intuitive à une physique quantitative et expérimentale.</w:t>
       </w:r>
     </w:p>
-    <w:p>
-      <w:pPr>
-        <w:pStyle w:val="BodyText"/>
-      </w:pPr>
-      <w:r>
-        <w:t xml:space="preserve">▶ Vidéo :</w:t>
-      </w:r>
-      <w:r>
-        <w:t xml:space="preserve"> </w:t>
-      </w:r>
-      <w:hyperlink r:id="rId31">
-        <w:r>
-          <w:rPr>
-            <w:rStyle w:val="Hyperlink"/>
-          </w:rPr>
-          <w:t xml:space="preserve">regarder la vidéo en ligne</w:t>
-        </w:r>
-      </w:hyperlink>
-    </w:p>
-    <w:p>
-      <w:pPr>
-        <w:pStyle w:val="BodyText"/>
-      </w:pPr>
-      <w:r>
-        <w:t xml:space="preserve">Crédit : Wikimedia Commons Voir la source</w:t>
-      </w:r>
-    </w:p>
-    <w:p>
-      <w:pPr>
-        <w:pStyle w:val="BodyText"/>
-      </w:pPr>
-      <w:r>
-        <w:t xml:space="preserve">L'étude de la chute libre représente l'un des plus grands bouleversements de l'histoire des sciences, marquant le passage d'une philosophie qualitative et intuitive à une physique quantitative et expérimentale.</w:t>
-      </w:r>
-    </w:p>
-    <w:bookmarkEnd w:id="32"/>
-    <w:bookmarkEnd w:id="33"/>
-    <w:bookmarkStart w:id="37" w:name="p4"/>
+    <w:bookmarkEnd w:id="44"/>
+    <w:bookmarkEnd w:id="45"/>
+    <w:bookmarkStart w:id="49" w:name="p4"/>
     <w:p>
       <w:pPr>
         <w:pStyle w:val="Heading1"/>
@@ -1088,18 +1496,18 @@
           <wp:inline>
             <wp:extent cx="4267200" cy="2275840"/>
             <wp:effectExtent b="0" l="0" r="0" t="0"/>
-            <wp:docPr descr="Une plume de 100 g et une bille d'acier de 2,0 kg sont lâchées en même temps d'une hauteur de 10 m et tombent côte à côte jusqu'au sol" title="" id="35" name="Picture"/>
+            <wp:docPr descr="Une plume de 100 g et une bille d'acier de 2,0 kg sont lâchées en même temps d'une hauteur de 10 m et tombent côte à côte jusqu'au sol" title="" id="47" name="Picture"/>
             <a:graphic>
               <a:graphicData uri="http://schemas.openxmlformats.org/drawingml/2006/picture">
                 <pic:pic>
                   <pic:nvPicPr>
-                    <pic:cNvPr descr="/tmp/tmpxjn2pb47/fig-1.png" id="36" name="Picture"/>
+                    <pic:cNvPr descr="/tmp/tmp6ohqn6ia/fig-5.png" id="48" name="Picture"/>
                     <pic:cNvPicPr>
                       <a:picLocks noChangeArrowheads="1" noChangeAspect="1"/>
                     </pic:cNvPicPr>
                   </pic:nvPicPr>
                   <pic:blipFill>
-                    <a:blip r:embed="rId34"/>
+                    <a:blip r:embed="rId46"/>
                     <a:stretch>
                       <a:fillRect/>
                     </a:stretch>
@@ -2714,8 +3122,8 @@
       </w:tr>
     </w:tbl>
     <w:p/>
-    <w:bookmarkEnd w:id="37"/>
-    <w:bookmarkStart w:id="41" w:name="p5"/>
+    <w:bookmarkEnd w:id="49"/>
+    <w:bookmarkStart w:id="53" w:name="p5"/>
     <w:p>
       <w:pPr>
         <w:pStyle w:val="Heading1"/>
@@ -2976,18 +3384,18 @@
           <wp:inline>
             <wp:extent cx="4267200" cy="2773680"/>
             <wp:effectExtent b="0" l="0" r="0" t="0"/>
-            <wp:docPr descr="Globe terrestre centré sur l'Amérique avec l'accélération gravitationnelle au Pôle Nord, à Edmonton, à Toronto, à l'équateur et au mont Everest, situé en Asie dans l'hémisphère nord" title="" id="39" name="Picture"/>
+            <wp:docPr descr="Globe terrestre centré sur l'Amérique avec l'accélération gravitationnelle au Pôle Nord, à Edmonton, à Toronto, à l'équateur et au mont Everest, situé en Asie dans l'hémisphère nord" title="" id="51" name="Picture"/>
             <a:graphic>
               <a:graphicData uri="http://schemas.openxmlformats.org/drawingml/2006/picture">
                 <pic:pic>
                   <pic:nvPicPr>
-                    <pic:cNvPr descr="/tmp/tmpxjn2pb47/fig-2.png" id="40" name="Picture"/>
+                    <pic:cNvPr descr="/tmp/tmp6ohqn6ia/fig-6.png" id="52" name="Picture"/>
                     <pic:cNvPicPr>
                       <a:picLocks noChangeArrowheads="1" noChangeAspect="1"/>
                     </pic:cNvPicPr>
                   </pic:nvPicPr>
                   <pic:blipFill>
-                    <a:blip r:embed="rId38"/>
+                    <a:blip r:embed="rId50"/>
                     <a:stretch>
                       <a:fillRect/>
                     </a:stretch>
@@ -3043,14 +3451,152 @@
         <w:t xml:space="preserve">est toujours constant et nous utiliserons la valeur de −9,81 m/s². Tu n'as pas besoin de mémoriser cette valeur; elle se trouve sur ta feuille de formules.</w:t>
       </w:r>
     </w:p>
-    <w:bookmarkEnd w:id="41"/>
-    <w:bookmarkStart w:id="50" w:name="p6"/>
+    <w:bookmarkEnd w:id="53"/>
+    <w:bookmarkStart w:id="65" w:name="p6"/>
     <w:p>
       <w:pPr>
         <w:pStyle w:val="Heading1"/>
       </w:pPr>
       <w:r>
         <w:t xml:space="preserve">Laboratoire : accélération gravitationnelle</w:t>
+      </w:r>
+    </w:p>
+    <w:tbl>
+      <w:tblPr>
+        <w:tblW w:w="5000" w:type="pct"/>
+        <w:jc w:val="start"/>
+        <w:tblBorders>
+          <w:top w:val="single" w:sz="6" w:space="0" w:color="9AA5AB"/>
+          <w:left w:val="single" w:sz="6" w:space="0" w:color="9AA5AB"/>
+          <w:bottom w:val="single" w:sz="6" w:space="0" w:color="9AA5AB"/>
+          <w:right w:val="single" w:sz="6" w:space="0" w:color="9AA5AB"/>
+        </w:tblBorders>
+      </w:tblPr>
+      <w:tblGrid>
+        <w:gridCol w:w="1900"/>
+        <w:gridCol w:w="7400"/>
+      </w:tblGrid>
+      <w:tr>
+        <w:trPr>
+          <w:cantSplit/>
+        </w:trPr>
+        <w:tc>
+          <w:tcPr>
+            <w:tcW w:w="1900" w:type="dxa"/>
+            <w:shd w:val="clear" w:color="auto" w:fill="FFFFFF"/>
+            <w:tcMar>
+              <w:top w:w="120" w:type="dxa"/>
+              <w:left w:w="120" w:type="dxa"/>
+              <w:bottom w:w="120" w:type="dxa"/>
+              <w:right w:w="120" w:type="dxa"/>
+            </w:tcMar>
+          </w:tcPr>
+          <w:p>
+            <w:pPr>
+              <w:jc w:val="left"/>
+            </w:pPr>
+            <w:r>
+              <w:rPr/>
+              <w:drawing>
+                <wp:inline>
+                  <wp:extent cx="1005840" cy="1005840"/>
+                  <wp:effectExtent b="0" l="0" r="0" t="0"/>
+                  <wp:docPr descr="Code QR de la vidéo" title="" id="55" name="Picture"/>
+                  <a:graphic>
+                    <a:graphicData uri="http://schemas.openxmlformats.org/drawingml/2006/picture">
+                      <pic:pic>
+                        <pic:nvPicPr>
+                          <pic:cNvPr descr="/tmp/tmp6ohqn6ia/qr-7.png" id="56" name="Picture"/>
+                          <pic:cNvPicPr>
+                            <a:picLocks noChangeArrowheads="1" noChangeAspect="1"/>
+                          </pic:cNvPicPr>
+                        </pic:nvPicPr>
+                        <pic:blipFill>
+                          <a:blip r:embed="rId54"/>
+                          <a:stretch>
+                            <a:fillRect/>
+                          </a:stretch>
+                        </pic:blipFill>
+                        <pic:spPr bwMode="auto">
+                          <a:xfrm>
+                            <a:off x="0" y="0"/>
+                            <a:ext cx="1005840" cy="1005840"/>
+                          </a:xfrm>
+                          <a:prstGeom prst="rect">
+                            <a:avLst/>
+                          </a:prstGeom>
+                          <a:noFill/>
+                          <a:ln w="9525">
+                            <a:noFill/>
+                            <a:headEnd/>
+                            <a:tailEnd/>
+                          </a:ln>
+                        </pic:spPr>
+                      </pic:pic>
+                    </a:graphicData>
+                  </a:graphic>
+                </wp:inline>
+              </w:drawing>
+            </w:r>
+          </w:p>
+        </w:tc>
+        <w:tc>
+          <w:tcPr>
+            <w:tcW w:w="7400" w:type="dxa"/>
+            <w:vAlign w:val="center"/>
+          </w:tcPr>
+          <w:p>
+            <w:pPr>
+              <w:jc w:val="left"/>
+            </w:pPr>
+            <w:r>
+              <w:rPr>
+                <w:bCs/>
+                <w:b/>
+              </w:rPr>
+              <w:t xml:space="preserve">▶ Vidéo</w:t>
+            </w:r>
+          </w:p>
+          <w:p>
+            <w:pPr>
+              <w:jc w:val="left"/>
+            </w:pPr>
+            <w:r>
+              <w:t xml:space="preserve">La vidéo ne peut pas jouer dans le document Word. Scanne le code avec une tablette ou un téléphone, ou clique sur le lien :</w:t>
+            </w:r>
+          </w:p>
+          <w:p>
+            <w:pPr>
+              <w:jc w:val="left"/>
+            </w:pPr>
+            <w:hyperlink r:id="rId57">
+              <w:r>
+                <w:rPr>
+                  <w:rStyle w:val="Hyperlink"/>
+                </w:rPr>
+                <w:t xml:space="preserve">https://cdn.jsdelivr.net/gh/sckurosaki/lachutelibre@main/video/video-4.mp4</w:t>
+              </w:r>
+            </w:hyperlink>
+          </w:p>
+        </w:tc>
+      </w:tr>
+    </w:tbl>
+    <w:p/>
+    <w:p>
+      <w:pPr>
+        <w:pStyle w:val="Credit"/>
+      </w:pPr>
+      <w:r>
+        <w:t xml:space="preserve">Crédit : Créer avec Anthropic Claude IA.</w:t>
+      </w:r>
+    </w:p>
+    <w:bookmarkStart w:id="58" w:name="but-de-lexpérience"/>
+    <w:p>
+      <w:pPr>
+        <w:pStyle w:val="Heading2"/>
+      </w:pPr>
+      <w:r>
+        <w:t xml:space="preserve">But de l’expérience</w:t>
       </w:r>
     </w:p>
     <w:p>
@@ -3058,81 +3604,45 @@
         <w:pStyle w:val="FirstParagraph"/>
       </w:pPr>
       <w:r>
-        <w:t xml:space="preserve">▶ Vidéo :</w:t>
-      </w:r>
-      <w:r>
-        <w:t xml:space="preserve"> </w:t>
-      </w:r>
-      <w:hyperlink r:id="rId42">
-        <w:r>
-          <w:rPr>
-            <w:rStyle w:val="Hyperlink"/>
-          </w:rPr>
-          <w:t xml:space="preserve">regarder la vidéo en ligne</w:t>
-        </w:r>
-      </w:hyperlink>
+        <w:t xml:space="preserve">Détermine l’accélération de cinq objets en chute libre à partir de la hauteur de chute et du temps de chute, puis compare les résultats à la valeur théorique de −9,81 m/s².</w:t>
+      </w:r>
+    </w:p>
+    <w:bookmarkEnd w:id="58"/>
+    <w:bookmarkStart w:id="59" w:name="hypothèse"/>
+    <w:p>
+      <w:pPr>
+        <w:pStyle w:val="Heading2"/>
+      </w:pPr>
+      <w:r>
+        <w:t xml:space="preserve">Hypothèse</w:t>
+      </w:r>
     </w:p>
     <w:p>
       <w:pPr>
-        <w:pStyle w:val="BodyText"/>
-      </w:pPr>
-      <w:r>
-        <w:t xml:space="preserve">Crédit : Créer avec Anthropic Claude IA.</w:t>
-      </w:r>
-    </w:p>
-    <w:bookmarkStart w:id="43" w:name="but-de-lexpérience"/>
-    <w:p>
-      <w:pPr>
-        <w:pStyle w:val="Heading2"/>
-      </w:pPr>
-      <w:r>
-        <w:t xml:space="preserve">But de l’expérience</w:t>
+        <w:pStyle w:val="FirstParagraph"/>
+      </w:pPr>
+      <w:r>
+        <w:t xml:space="preserve">Écris une hypothèse :</w:t>
       </w:r>
     </w:p>
     <w:p>
       <w:pPr>
-        <w:pStyle w:val="FirstParagraph"/>
-      </w:pPr>
-      <w:r>
-        <w:t xml:space="preserve">Détermine l’accélération de cinq objets en chute libre à partir de la hauteur de chute et du temps de chute, puis compare les résultats à la valeur théorique de −9,81 m/s².</w:t>
-      </w:r>
-    </w:p>
-    <w:bookmarkEnd w:id="43"/>
-    <w:bookmarkStart w:id="44" w:name="hypothèse"/>
-    <w:p>
-      <w:pPr>
-        <w:pStyle w:val="Heading2"/>
-      </w:pPr>
-      <w:r>
-        <w:t xml:space="preserve">Hypothèse</w:t>
+        <w:pStyle w:val="BodyText"/>
+      </w:pPr>
+      <w:r>
+        <w:t xml:space="preserve">Est-ce que les cinq objets auront la même accélération?</w:t>
       </w:r>
     </w:p>
     <w:p>
       <w:pPr>
-        <w:pStyle w:val="FirstParagraph"/>
-      </w:pPr>
-      <w:r>
-        <w:t xml:space="preserve">Écris une hypothèse :</w:t>
+        <w:pStyle w:val="BodyText"/>
+      </w:pPr>
+      <w:r>
+        <w:t xml:space="preserve">Explique ton raisonnement en tenant compte de la forme de l'objet, de sa masse et de la résistance de l’air. </w:t>
       </w:r>
     </w:p>
-    <w:p>
-      <w:pPr>
-        <w:pStyle w:val="BodyText"/>
-      </w:pPr>
-      <w:r>
-        <w:t xml:space="preserve">Est-ce que les cinq objets auront la même accélération?</w:t>
-      </w:r>
-    </w:p>
-    <w:p>
-      <w:pPr>
-        <w:pStyle w:val="BodyText"/>
-      </w:pPr>
-      <w:r>
-        <w:t xml:space="preserve">Explique ton raisonnement en tenant compte de la forme de l'objet, de sa masse et de la résistance de l’air. </w:t>
-      </w:r>
-    </w:p>
-    <w:bookmarkEnd w:id="44"/>
-    <w:bookmarkStart w:id="45" w:name="matériel"/>
+    <w:bookmarkEnd w:id="59"/>
+    <w:bookmarkStart w:id="60" w:name="matériel"/>
     <w:p>
       <w:pPr>
         <w:pStyle w:val="Heading2"/>
@@ -3362,8 +3872,8 @@
       </w:tr>
     </w:tbl>
     <w:p/>
-    <w:bookmarkEnd w:id="45"/>
-    <w:bookmarkStart w:id="46" w:name="démarche"/>
+    <w:bookmarkEnd w:id="60"/>
+    <w:bookmarkStart w:id="61" w:name="démarche"/>
     <w:p>
       <w:pPr>
         <w:pStyle w:val="Heading2"/>
@@ -3480,8 +3990,8 @@
         <w:t xml:space="preserve">Calcule l’accélération de chaque objet en utilisant le temps moyen.</w:t>
       </w:r>
     </w:p>
-    <w:bookmarkEnd w:id="46"/>
-    <w:bookmarkStart w:id="47" w:name="observations-et-données"/>
+    <w:bookmarkEnd w:id="61"/>
+    <w:bookmarkStart w:id="62" w:name="observations-et-données"/>
     <w:p>
       <w:pPr>
         <w:pStyle w:val="Heading2"/>
@@ -3906,8 +4416,8 @@
         </w:tc>
       </w:tr>
     </w:tbl>
-    <w:bookmarkEnd w:id="47"/>
-    <w:bookmarkStart w:id="48" w:name="analyse"/>
+    <w:bookmarkEnd w:id="62"/>
+    <w:bookmarkStart w:id="63" w:name="analyse"/>
     <w:p>
       <w:pPr>
         <w:pStyle w:val="Heading2"/>
@@ -3994,8 +4504,8 @@
         <w:t xml:space="preserve">Pourquoi faire trois essais et calculer une moyenne améliore-t-il la fiabilité des résultats?</w:t>
       </w:r>
     </w:p>
-    <w:bookmarkEnd w:id="48"/>
-    <w:bookmarkStart w:id="49" w:name="conclusion"/>
+    <w:bookmarkEnd w:id="63"/>
+    <w:bookmarkStart w:id="64" w:name="conclusion"/>
     <w:p>
       <w:pPr>
         <w:pStyle w:val="Heading2"/>
@@ -4024,9 +4534,9 @@
         <w:t xml:space="preserve">Explique ce qui se passerait dans le vide et fais le lien avec les travaux de Galilée et l’expérience d’Apollo 15.</w:t>
       </w:r>
     </w:p>
-    <w:bookmarkEnd w:id="49"/>
-    <w:bookmarkEnd w:id="50"/>
-    <w:bookmarkStart w:id="57" w:name="p7"/>
+    <w:bookmarkEnd w:id="64"/>
+    <w:bookmarkEnd w:id="65"/>
+    <w:bookmarkStart w:id="72" w:name="p7"/>
     <w:p>
       <w:pPr>
         <w:pStyle w:val="Heading1"/>
@@ -4075,7 +4585,7 @@
           <w:numId w:val="1013"/>
         </w:numPr>
       </w:pPr>
-      <w:hyperlink r:id="rId51">
+      <w:hyperlink r:id="rId66">
         <w:r>
           <w:rPr>
             <w:rStyle w:val="Hyperlink"/>
@@ -4092,7 +4602,7 @@
           <w:numId w:val="1013"/>
         </w:numPr>
       </w:pPr>
-      <w:hyperlink r:id="rId52">
+      <w:hyperlink r:id="rId67">
         <w:r>
           <w:rPr>
             <w:rStyle w:val="Hyperlink"/>
@@ -4101,7 +4611,7 @@
         </w:r>
       </w:hyperlink>
     </w:p>
-    <w:bookmarkStart w:id="56" w:name="problème"/>
+    <w:bookmarkStart w:id="71" w:name="problème"/>
     <w:p>
       <w:pPr>
         <w:pStyle w:val="Heading2"/>
@@ -4127,18 +4637,18 @@
           <wp:inline>
             <wp:extent cx="3733800" cy="1879734"/>
             <wp:effectExtent b="0" l="0" r="0" t="0"/>
-            <wp:docPr descr="Chute d'un bison de 10 m." title="" id="54" name="Picture"/>
+            <wp:docPr descr="Chute d'un bison de 10 m." title="" id="69" name="Picture"/>
             <a:graphic>
               <a:graphicData uri="http://schemas.openxmlformats.org/drawingml/2006/picture">
                 <pic:pic>
                   <pic:nvPicPr>
-                    <pic:cNvPr descr="/home/claude/lachutelibre/image/image-1.png" id="55" name="Picture"/>
+                    <pic:cNvPr descr="/home/claude/lachutelibre/image/image-1.png" id="70" name="Picture"/>
                     <pic:cNvPicPr>
                       <a:picLocks noChangeArrowheads="1" noChangeAspect="1"/>
                     </pic:cNvPicPr>
                   </pic:nvPicPr>
                   <pic:blipFill>
-                    <a:blip r:embed="rId53"/>
+                    <a:blip r:embed="rId68"/>
                     <a:stretch>
                       <a:fillRect/>
                     </a:stretch>
@@ -4167,7 +4677,7 @@
     </w:p>
     <w:p>
       <w:pPr>
-        <w:pStyle w:val="BodyText"/>
+        <w:pStyle w:val="Credit"/>
       </w:pPr>
       <w:r>
         <w:t xml:space="preserve">Crédit : Illustration créée par Claude (IA), Anthropic.</w:t>
@@ -4918,9 +5428,9 @@
       </w:tr>
     </w:tbl>
     <w:p/>
-    <w:bookmarkEnd w:id="56"/>
-    <w:bookmarkEnd w:id="57"/>
-    <w:bookmarkStart w:id="68" w:name="p8"/>
+    <w:bookmarkEnd w:id="71"/>
+    <w:bookmarkEnd w:id="72"/>
+    <w:bookmarkStart w:id="89" w:name="p8"/>
     <w:p>
       <w:pPr>
         <w:pStyle w:val="Heading1"/>
@@ -4929,7 +5439,7 @@
         <w:t xml:space="preserve">Pratique guidée</w:t>
       </w:r>
     </w:p>
-    <w:bookmarkStart w:id="62" w:name="problème-1"/>
+    <w:bookmarkStart w:id="80" w:name="problème-1"/>
     <w:p>
       <w:pPr>
         <w:pStyle w:val="Heading2"/>
@@ -4955,18 +5465,18 @@
           <wp:inline>
             <wp:extent cx="2667000" cy="4333875"/>
             <wp:effectExtent b="0" l="0" r="0" t="0"/>
-            <wp:docPr descr="Tour à Calgary" title="" id="59" name="Picture"/>
+            <wp:docPr descr="Tour à Calgary" title="" id="74" name="Picture"/>
             <a:graphic>
               <a:graphicData uri="http://schemas.openxmlformats.org/drawingml/2006/picture">
                 <pic:pic>
                   <pic:nvPicPr>
-                    <pic:cNvPr descr="/home/claude/lachutelibre/image/image-2.jpg" id="60" name="Picture"/>
+                    <pic:cNvPr descr="/home/claude/lachutelibre/image/image-2.jpg" id="75" name="Picture"/>
                     <pic:cNvPicPr>
                       <a:picLocks noChangeArrowheads="1" noChangeAspect="1"/>
                     </pic:cNvPicPr>
                   </pic:nvPicPr>
                   <pic:blipFill>
-                    <a:blip r:embed="rId58"/>
+                    <a:blip r:embed="rId73"/>
                     <a:stretch>
                       <a:fillRect/>
                     </a:stretch>
@@ -4995,7 +5505,7 @@
     </w:p>
     <w:p>
       <w:pPr>
-        <w:pStyle w:val="BodyText"/>
+        <w:pStyle w:val="Credit"/>
       </w:pPr>
       <w:r>
         <w:t xml:space="preserve">Crédit : commons.wikimedia.org Voir la source</w:t>
@@ -5656,34 +6166,137 @@
                     <w:t xml:space="preserve"> </w:t>
                   </w:r>
                 </w:p>
+                <w:tbl>
+                  <w:tblPr>
+                    <w:tblW w:w="5000" w:type="pct"/>
+                    <w:jc w:val="start"/>
+                    <w:tblBorders>
+                      <w:top w:val="single" w:sz="6" w:space="0" w:color="9AA5AB"/>
+                      <w:left w:val="single" w:sz="6" w:space="0" w:color="9AA5AB"/>
+                      <w:bottom w:val="single" w:sz="6" w:space="0" w:color="9AA5AB"/>
+                      <w:right w:val="single" w:sz="6" w:space="0" w:color="9AA5AB"/>
+                    </w:tblBorders>
+                  </w:tblPr>
+                  <w:tblGrid>
+                    <w:gridCol w:w="1900"/>
+                    <w:gridCol w:w="7400"/>
+                  </w:tblGrid>
+                  <w:tr>
+                    <w:trPr>
+                      <w:cantSplit/>
+                    </w:trPr>
+                    <w:tc>
+                      <w:tcPr>
+                        <w:tcW w:w="1900" w:type="dxa"/>
+                        <w:shd w:val="clear" w:color="auto" w:fill="FFFFFF"/>
+                        <w:tcMar>
+                          <w:top w:w="120" w:type="dxa"/>
+                          <w:left w:w="120" w:type="dxa"/>
+                          <w:bottom w:w="120" w:type="dxa"/>
+                          <w:right w:w="120" w:type="dxa"/>
+                        </w:tcMar>
+                      </w:tcPr>
+                      <w:p>
+                        <w:pPr>
+                          <w:jc w:val="left"/>
+                        </w:pPr>
+                        <w:r>
+                          <w:rPr>
+                            <w:color w:val="1E6B2E"/>
+                          </w:rPr>
+                          <w:drawing>
+                            <wp:inline>
+                              <wp:extent cx="1005840" cy="1005840"/>
+                              <wp:effectExtent b="0" l="0" r="0" t="0"/>
+                              <wp:docPr descr="Code QR de la vidéo" title="" id="77" name="Picture"/>
+                              <a:graphic>
+                                <a:graphicData uri="http://schemas.openxmlformats.org/drawingml/2006/picture">
+                                  <pic:pic>
+                                    <pic:nvPicPr>
+                                      <pic:cNvPr descr="/tmp/tmp6ohqn6ia/qr-8.png" id="78" name="Picture"/>
+                                      <pic:cNvPicPr>
+                                        <a:picLocks noChangeArrowheads="1" noChangeAspect="1"/>
+                                      </pic:cNvPicPr>
+                                    </pic:nvPicPr>
+                                    <pic:blipFill>
+                                      <a:blip r:embed="rId76"/>
+                                      <a:stretch>
+                                        <a:fillRect/>
+                                      </a:stretch>
+                                    </pic:blipFill>
+                                    <pic:spPr bwMode="auto">
+                                      <a:xfrm>
+                                        <a:off x="0" y="0"/>
+                                        <a:ext cx="1005840" cy="1005840"/>
+                                      </a:xfrm>
+                                      <a:prstGeom prst="rect">
+                                        <a:avLst/>
+                                      </a:prstGeom>
+                                      <a:noFill/>
+                                      <a:ln w="9525">
+                                        <a:noFill/>
+                                        <a:headEnd/>
+                                        <a:tailEnd/>
+                                      </a:ln>
+                                    </pic:spPr>
+                                  </pic:pic>
+                                </a:graphicData>
+                              </a:graphic>
+                            </wp:inline>
+                          </w:drawing>
+                        </w:r>
+                      </w:p>
+                    </w:tc>
+                    <w:tc>
+                      <w:tcPr>
+                        <w:tcW w:w="7400" w:type="dxa"/>
+                        <w:vAlign w:val="center"/>
+                      </w:tcPr>
+                      <w:p>
+                        <w:pPr>
+                          <w:jc w:val="left"/>
+                        </w:pPr>
+                        <w:r>
+                          <w:rPr>
+                            <w:bCs/>
+                            <w:b/>
+                            <w:color w:val="1E6B2E"/>
+                          </w:rPr>
+                          <w:t xml:space="preserve">▶ Vidéo : Résolution du problème</w:t>
+                        </w:r>
+                      </w:p>
+                      <w:p>
+                        <w:pPr>
+                          <w:jc w:val="left"/>
+                        </w:pPr>
+                        <w:r>
+                          <w:rPr>
+                            <w:color w:val="1E6B2E"/>
+                          </w:rPr>
+                          <w:t xml:space="preserve">La vidéo ne peut pas jouer dans le document Word. Scanne le code avec une tablette ou un téléphone, ou clique sur le lien :</w:t>
+                        </w:r>
+                      </w:p>
+                      <w:p>
+                        <w:pPr>
+                          <w:jc w:val="left"/>
+                        </w:pPr>
+                        <w:hyperlink r:id="rId79">
+                          <w:r>
+                            <w:rPr>
+                              <w:rStyle w:val="Hyperlink"/>
+                              <w:color w:val="1E6B2E"/>
+                            </w:rPr>
+                            <w:t xml:space="preserve">https://cdn.jsdelivr.net/gh/sckurosaki/lachutelibre@main/video/video-5.mp4</w:t>
+                          </w:r>
+                        </w:hyperlink>
+                      </w:p>
+                    </w:tc>
+                  </w:tr>
+                </w:tbl>
+                <w:p/>
                 <w:p>
                   <w:pPr>
-                    <w:jc w:val="left"/>
-                  </w:pPr>
-                  <w:r>
-                    <w:rPr>
-                      <w:color w:val="1E6B2E"/>
-                    </w:rPr>
-                    <w:t xml:space="preserve">▶ Vidéo :</w:t>
-                  </w:r>
-                  <w:r>
-                    <w:rPr>
-                      <w:color w:val="1E6B2E"/>
-                    </w:rPr>
-                    <w:t xml:space="preserve"> </w:t>
-                  </w:r>
-                  <w:hyperlink r:id="rId61">
-                    <w:r>
-                      <w:rPr>
-                        <w:rStyle w:val="Hyperlink"/>
-                        <w:color w:val="1E6B2E"/>
-                      </w:rPr>
-                      <w:t xml:space="preserve">regarder la vidéo en ligne</w:t>
-                    </w:r>
-                  </w:hyperlink>
-                </w:p>
-                <w:p>
-                  <w:pPr>
+                    <w:pStyle w:val="Credit"/>
                     <w:jc w:val="left"/>
                   </w:pPr>
                   <w:r>
@@ -5701,8 +6314,8 @@
       </w:tr>
     </w:tbl>
     <w:p/>
-    <w:bookmarkEnd w:id="62"/>
-    <w:bookmarkStart w:id="67" w:name="problème-2"/>
+    <w:bookmarkEnd w:id="80"/>
+    <w:bookmarkStart w:id="88" w:name="problème-2"/>
     <w:p>
       <w:pPr>
         <w:pStyle w:val="Heading2"/>
@@ -5728,18 +6341,18 @@
           <wp:inline>
             <wp:extent cx="3733800" cy="2489200"/>
             <wp:effectExtent b="0" l="0" r="0" t="0"/>
-            <wp:docPr descr="Passerelle Columbia Icefield Skywalk" title="" id="64" name="Picture"/>
+            <wp:docPr descr="Passerelle Columbia Icefield Skywalk" title="" id="82" name="Picture"/>
             <a:graphic>
               <a:graphicData uri="http://schemas.openxmlformats.org/drawingml/2006/picture">
                 <pic:pic>
                   <pic:nvPicPr>
-                    <pic:cNvPr descr="/home/claude/lachutelibre/image/image-3.jpg" id="65" name="Picture"/>
+                    <pic:cNvPr descr="/home/claude/lachutelibre/image/image-3.jpg" id="83" name="Picture"/>
                     <pic:cNvPicPr>
                       <a:picLocks noChangeArrowheads="1" noChangeAspect="1"/>
                     </pic:cNvPicPr>
                   </pic:nvPicPr>
                   <pic:blipFill>
-                    <a:blip r:embed="rId63"/>
+                    <a:blip r:embed="rId81"/>
                     <a:stretch>
                       <a:fillRect/>
                     </a:stretch>
@@ -5768,7 +6381,7 @@
     </w:p>
     <w:p>
       <w:pPr>
-        <w:pStyle w:val="BodyText"/>
+        <w:pStyle w:val="Credit"/>
       </w:pPr>
       <w:r>
         <w:t xml:space="preserve">Crédit : commons.wikimedia.org Voir la source</w:t>
@@ -6513,34 +7126,137 @@
                     <w:t xml:space="preserve"> </w:t>
                   </w:r>
                 </w:p>
+                <w:tbl>
+                  <w:tblPr>
+                    <w:tblW w:w="5000" w:type="pct"/>
+                    <w:jc w:val="start"/>
+                    <w:tblBorders>
+                      <w:top w:val="single" w:sz="6" w:space="0" w:color="9AA5AB"/>
+                      <w:left w:val="single" w:sz="6" w:space="0" w:color="9AA5AB"/>
+                      <w:bottom w:val="single" w:sz="6" w:space="0" w:color="9AA5AB"/>
+                      <w:right w:val="single" w:sz="6" w:space="0" w:color="9AA5AB"/>
+                    </w:tblBorders>
+                  </w:tblPr>
+                  <w:tblGrid>
+                    <w:gridCol w:w="1900"/>
+                    <w:gridCol w:w="7400"/>
+                  </w:tblGrid>
+                  <w:tr>
+                    <w:trPr>
+                      <w:cantSplit/>
+                    </w:trPr>
+                    <w:tc>
+                      <w:tcPr>
+                        <w:tcW w:w="1900" w:type="dxa"/>
+                        <w:shd w:val="clear" w:color="auto" w:fill="FFFFFF"/>
+                        <w:tcMar>
+                          <w:top w:w="120" w:type="dxa"/>
+                          <w:left w:w="120" w:type="dxa"/>
+                          <w:bottom w:w="120" w:type="dxa"/>
+                          <w:right w:w="120" w:type="dxa"/>
+                        </w:tcMar>
+                      </w:tcPr>
+                      <w:p>
+                        <w:pPr>
+                          <w:jc w:val="left"/>
+                        </w:pPr>
+                        <w:r>
+                          <w:rPr>
+                            <w:color w:val="1E6B2E"/>
+                          </w:rPr>
+                          <w:drawing>
+                            <wp:inline>
+                              <wp:extent cx="1005840" cy="1005840"/>
+                              <wp:effectExtent b="0" l="0" r="0" t="0"/>
+                              <wp:docPr descr="Code QR de la vidéo" title="" id="85" name="Picture"/>
+                              <a:graphic>
+                                <a:graphicData uri="http://schemas.openxmlformats.org/drawingml/2006/picture">
+                                  <pic:pic>
+                                    <pic:nvPicPr>
+                                      <pic:cNvPr descr="/tmp/tmp6ohqn6ia/qr-9.png" id="86" name="Picture"/>
+                                      <pic:cNvPicPr>
+                                        <a:picLocks noChangeArrowheads="1" noChangeAspect="1"/>
+                                      </pic:cNvPicPr>
+                                    </pic:nvPicPr>
+                                    <pic:blipFill>
+                                      <a:blip r:embed="rId84"/>
+                                      <a:stretch>
+                                        <a:fillRect/>
+                                      </a:stretch>
+                                    </pic:blipFill>
+                                    <pic:spPr bwMode="auto">
+                                      <a:xfrm>
+                                        <a:off x="0" y="0"/>
+                                        <a:ext cx="1005840" cy="1005840"/>
+                                      </a:xfrm>
+                                      <a:prstGeom prst="rect">
+                                        <a:avLst/>
+                                      </a:prstGeom>
+                                      <a:noFill/>
+                                      <a:ln w="9525">
+                                        <a:noFill/>
+                                        <a:headEnd/>
+                                        <a:tailEnd/>
+                                      </a:ln>
+                                    </pic:spPr>
+                                  </pic:pic>
+                                </a:graphicData>
+                              </a:graphic>
+                            </wp:inline>
+                          </w:drawing>
+                        </w:r>
+                      </w:p>
+                    </w:tc>
+                    <w:tc>
+                      <w:tcPr>
+                        <w:tcW w:w="7400" w:type="dxa"/>
+                        <w:vAlign w:val="center"/>
+                      </w:tcPr>
+                      <w:p>
+                        <w:pPr>
+                          <w:jc w:val="left"/>
+                        </w:pPr>
+                        <w:r>
+                          <w:rPr>
+                            <w:bCs/>
+                            <w:b/>
+                            <w:color w:val="1E6B2E"/>
+                          </w:rPr>
+                          <w:t xml:space="preserve">▶ Vidéo : Vidéo de la solution.</w:t>
+                        </w:r>
+                      </w:p>
+                      <w:p>
+                        <w:pPr>
+                          <w:jc w:val="left"/>
+                        </w:pPr>
+                        <w:r>
+                          <w:rPr>
+                            <w:color w:val="1E6B2E"/>
+                          </w:rPr>
+                          <w:t xml:space="preserve">La vidéo ne peut pas jouer dans le document Word. Scanne le code avec une tablette ou un téléphone, ou clique sur le lien :</w:t>
+                        </w:r>
+                      </w:p>
+                      <w:p>
+                        <w:pPr>
+                          <w:jc w:val="left"/>
+                        </w:pPr>
+                        <w:hyperlink r:id="rId87">
+                          <w:r>
+                            <w:rPr>
+                              <w:rStyle w:val="Hyperlink"/>
+                              <w:color w:val="1E6B2E"/>
+                            </w:rPr>
+                            <w:t xml:space="preserve">https://cdn.jsdelivr.net/gh/sckurosaki/lachutelibre@main/video/video-6.mp4</w:t>
+                          </w:r>
+                        </w:hyperlink>
+                      </w:p>
+                    </w:tc>
+                  </w:tr>
+                </w:tbl>
+                <w:p/>
                 <w:p>
                   <w:pPr>
-                    <w:jc w:val="left"/>
-                  </w:pPr>
-                  <w:r>
-                    <w:rPr>
-                      <w:color w:val="1E6B2E"/>
-                    </w:rPr>
-                    <w:t xml:space="preserve">▶ Vidéo :</w:t>
-                  </w:r>
-                  <w:r>
-                    <w:rPr>
-                      <w:color w:val="1E6B2E"/>
-                    </w:rPr>
-                    <w:t xml:space="preserve"> </w:t>
-                  </w:r>
-                  <w:hyperlink r:id="rId66">
-                    <w:r>
-                      <w:rPr>
-                        <w:rStyle w:val="Hyperlink"/>
-                        <w:color w:val="1E6B2E"/>
-                      </w:rPr>
-                      <w:t xml:space="preserve">regarder la vidéo en ligne</w:t>
-                    </w:r>
-                  </w:hyperlink>
-                </w:p>
-                <w:p>
-                  <w:pPr>
+                    <w:pStyle w:val="Credit"/>
                     <w:jc w:val="left"/>
                   </w:pPr>
                   <w:r>
@@ -6558,9 +7274,9 @@
       </w:tr>
     </w:tbl>
     <w:p/>
-    <w:bookmarkEnd w:id="67"/>
-    <w:bookmarkEnd w:id="68"/>
-    <w:bookmarkStart w:id="84" w:name="p9"/>
+    <w:bookmarkEnd w:id="88"/>
+    <w:bookmarkEnd w:id="89"/>
+    <w:bookmarkStart w:id="105" w:name="p9"/>
     <w:p>
       <w:pPr>
         <w:pStyle w:val="Heading1"/>
@@ -6712,18 +7428,18 @@
                 <wp:inline>
                   <wp:extent cx="3733800" cy="6223000"/>
                   <wp:effectExtent b="0" l="0" r="0" t="0"/>
-                  <wp:docPr descr="Au début du saut, la force gravitationnelle (Fg) est plus grande que le frottement de l'air (Ff) : Fg &gt; Ff, donc le parachutiste accélère." title="" id="70" name="Picture"/>
+                  <wp:docPr descr="Au début du saut, la force gravitationnelle (Fg) est plus grande que le frottement de l'air (Ff) : Fg &gt; Ff, donc le parachutiste accélère." title="" id="91" name="Picture"/>
                   <a:graphic>
                     <a:graphicData uri="http://schemas.openxmlformats.org/drawingml/2006/picture">
                       <pic:pic>
                         <pic:nvPicPr>
-                          <pic:cNvPr descr="/tmp/tmpxjn2pb47/svg-3.png" id="71" name="Picture"/>
+                          <pic:cNvPr descr="/tmp/tmp6ohqn6ia/svg-10.png" id="92" name="Picture"/>
                           <pic:cNvPicPr>
                             <a:picLocks noChangeArrowheads="1" noChangeAspect="1"/>
                           </pic:cNvPicPr>
                         </pic:nvPicPr>
                         <pic:blipFill>
-                          <a:blip r:embed="rId69"/>
+                          <a:blip r:embed="rId90"/>
                           <a:stretch>
                             <a:fillRect/>
                           </a:stretch>
@@ -6752,6 +7468,7 @@
           </w:p>
           <w:p>
             <w:pPr>
+              <w:pStyle w:val="Credit"/>
               <w:jc w:val="left"/>
             </w:pPr>
             <w:r>
@@ -6771,18 +7488,18 @@
                 <wp:inline>
                   <wp:extent cx="3733800" cy="6223000"/>
                   <wp:effectExtent b="0" l="0" r="0" t="0"/>
-                  <wp:docPr descr="Le parachutiste accélère toujours : le frottement de l'air augmente, mais reste inférieur à la force gravitationnelle, donc la vitesse croît de moins en moins vite." title="" id="73" name="Picture"/>
+                  <wp:docPr descr="Le parachutiste accélère toujours : le frottement de l'air augmente, mais reste inférieur à la force gravitationnelle, donc la vitesse croît de moins en moins vite." title="" id="94" name="Picture"/>
                   <a:graphic>
                     <a:graphicData uri="http://schemas.openxmlformats.org/drawingml/2006/picture">
                       <pic:pic>
                         <pic:nvPicPr>
-                          <pic:cNvPr descr="/tmp/tmpxjn2pb47/svg-4.png" id="74" name="Picture"/>
+                          <pic:cNvPr descr="/tmp/tmp6ohqn6ia/svg-11.png" id="95" name="Picture"/>
                           <pic:cNvPicPr>
                             <a:picLocks noChangeArrowheads="1" noChangeAspect="1"/>
                           </pic:cNvPicPr>
                         </pic:nvPicPr>
                         <pic:blipFill>
-                          <a:blip r:embed="rId72"/>
+                          <a:blip r:embed="rId93"/>
                           <a:stretch>
                             <a:fillRect/>
                           </a:stretch>
@@ -6811,6 +7528,7 @@
           </w:p>
           <w:p>
             <w:pPr>
+              <w:pStyle w:val="Credit"/>
               <w:jc w:val="left"/>
             </w:pPr>
             <w:r>
@@ -6830,18 +7548,18 @@
                 <wp:inline>
                   <wp:extent cx="3733800" cy="6223000"/>
                   <wp:effectExtent b="0" l="0" r="0" t="0"/>
-                  <wp:docPr descr="Un parachutiste en chute libre, en position horizontale, subit une force de frottement de l'air vers le haut égale à la force de gravité vers le bas : les forces s'équilibrent, donc sa vitesse reste constante (vitesse ultime)." title="" id="76" name="Picture"/>
+                  <wp:docPr descr="Un parachutiste en chute libre, en position horizontale, subit une force de frottement de l'air vers le haut égale à la force de gravité vers le bas : les forces s'équilibrent, donc sa vitesse reste constante (vitesse ultime)." title="" id="97" name="Picture"/>
                   <a:graphic>
                     <a:graphicData uri="http://schemas.openxmlformats.org/drawingml/2006/picture">
                       <pic:pic>
                         <pic:nvPicPr>
-                          <pic:cNvPr descr="/tmp/tmpxjn2pb47/svg-5.png" id="77" name="Picture"/>
+                          <pic:cNvPr descr="/tmp/tmp6ohqn6ia/svg-12.png" id="98" name="Picture"/>
                           <pic:cNvPicPr>
                             <a:picLocks noChangeArrowheads="1" noChangeAspect="1"/>
                           </pic:cNvPicPr>
                         </pic:nvPicPr>
                         <pic:blipFill>
-                          <a:blip r:embed="rId75"/>
+                          <a:blip r:embed="rId96"/>
                           <a:stretch>
                             <a:fillRect/>
                           </a:stretch>
@@ -6870,6 +7588,7 @@
           </w:p>
           <w:p>
             <w:pPr>
+              <w:pStyle w:val="Credit"/>
               <w:jc w:val="left"/>
             </w:pPr>
             <w:r>
@@ -6889,18 +7608,18 @@
                 <wp:inline>
                   <wp:extent cx="3733800" cy="6223000"/>
                   <wp:effectExtent b="0" l="0" r="0" t="0"/>
-                  <wp:docPr descr="Après l'ouverture du parachute, le frottement de l'air (Ff) devient supérieur à la force gravitationnelle (Fg), ce qui fait fortement ralentir le parachutiste." title="" id="79" name="Picture"/>
+                  <wp:docPr descr="Après l'ouverture du parachute, le frottement de l'air (Ff) devient supérieur à la force gravitationnelle (Fg), ce qui fait fortement ralentir le parachutiste." title="" id="100" name="Picture"/>
                   <a:graphic>
                     <a:graphicData uri="http://schemas.openxmlformats.org/drawingml/2006/picture">
                       <pic:pic>
                         <pic:nvPicPr>
-                          <pic:cNvPr descr="/tmp/tmpxjn2pb47/svg-6.png" id="80" name="Picture"/>
+                          <pic:cNvPr descr="/tmp/tmp6ohqn6ia/svg-13.png" id="101" name="Picture"/>
                           <pic:cNvPicPr>
                             <a:picLocks noChangeArrowheads="1" noChangeAspect="1"/>
                           </pic:cNvPicPr>
                         </pic:nvPicPr>
                         <pic:blipFill>
-                          <a:blip r:embed="rId78"/>
+                          <a:blip r:embed="rId99"/>
                           <a:stretch>
                             <a:fillRect/>
                           </a:stretch>
@@ -6929,6 +7648,7 @@
           </w:p>
           <w:p>
             <w:pPr>
+              <w:pStyle w:val="Credit"/>
               <w:jc w:val="left"/>
             </w:pPr>
             <w:r>
@@ -6947,18 +7667,18 @@
           <wp:inline>
             <wp:extent cx="3733800" cy="2364740"/>
             <wp:effectExtent b="0" l="0" r="0" t="0"/>
-            <wp:docPr descr="Le graphique montre la vitesse d'un parachutiste : elle augmente puis se stabilise à une vitesse ultime, avant de diminuer brusquement à l'ouverture du parachute et de se stabiliser à une vitesse ultime plus faible." title="" id="82" name="Picture"/>
+            <wp:docPr descr="Le graphique montre la vitesse d'un parachutiste : elle augmente puis se stabilise à une vitesse ultime, avant de diminuer brusquement à l'ouverture du parachute et de se stabiliser à une vitesse ultime plus faible." title="" id="103" name="Picture"/>
             <a:graphic>
               <a:graphicData uri="http://schemas.openxmlformats.org/drawingml/2006/picture">
                 <pic:pic>
                   <pic:nvPicPr>
-                    <pic:cNvPr descr="/tmp/tmpxjn2pb47/svg-7.png" id="83" name="Picture"/>
+                    <pic:cNvPr descr="/tmp/tmp6ohqn6ia/svg-14.png" id="104" name="Picture"/>
                     <pic:cNvPicPr>
                       <a:picLocks noChangeArrowheads="1" noChangeAspect="1"/>
                     </pic:cNvPicPr>
                   </pic:nvPicPr>
                   <pic:blipFill>
-                    <a:blip r:embed="rId81"/>
+                    <a:blip r:embed="rId102"/>
                     <a:stretch>
                       <a:fillRect/>
                     </a:stretch>
@@ -6987,7 +7707,7 @@
     </w:p>
     <w:p>
       <w:pPr>
-        <w:pStyle w:val="BodyText"/>
+        <w:pStyle w:val="Credit"/>
       </w:pPr>
       <w:r>
         <w:t xml:space="preserve">Crédit : Illustration créée par Claude (IA), Anthropic.</w:t>
@@ -7082,8 +7802,8 @@
         <w:t xml:space="preserve">Par exemple, une roche a une vitesse ultime plus grande qu'une plume.</w:t>
       </w:r>
     </w:p>
-    <w:bookmarkEnd w:id="84"/>
-    <w:bookmarkStart w:id="89" w:name="p10"/>
+    <w:bookmarkEnd w:id="105"/>
+    <w:bookmarkStart w:id="113" w:name="p10"/>
     <w:p>
       <w:pPr>
         <w:pStyle w:val="Heading1"/>
@@ -7100,28 +7820,130 @@
         <w:t xml:space="preserve">Puisque les corps en chute libre suivent le principe physique d'un mouvement accéléré, nous pouvons utiliser les formules qui s'appliquent à un tel mouvement.</w:t>
       </w:r>
     </w:p>
+    <w:tbl>
+      <w:tblPr>
+        <w:tblW w:w="5000" w:type="pct"/>
+        <w:jc w:val="start"/>
+        <w:tblBorders>
+          <w:top w:val="single" w:sz="6" w:space="0" w:color="9AA5AB"/>
+          <w:left w:val="single" w:sz="6" w:space="0" w:color="9AA5AB"/>
+          <w:bottom w:val="single" w:sz="6" w:space="0" w:color="9AA5AB"/>
+          <w:right w:val="single" w:sz="6" w:space="0" w:color="9AA5AB"/>
+        </w:tblBorders>
+      </w:tblPr>
+      <w:tblGrid>
+        <w:gridCol w:w="1900"/>
+        <w:gridCol w:w="7400"/>
+      </w:tblGrid>
+      <w:tr>
+        <w:trPr>
+          <w:cantSplit/>
+        </w:trPr>
+        <w:tc>
+          <w:tcPr>
+            <w:tcW w:w="1900" w:type="dxa"/>
+            <w:shd w:val="clear" w:color="auto" w:fill="FFFFFF"/>
+            <w:tcMar>
+              <w:top w:w="120" w:type="dxa"/>
+              <w:left w:w="120" w:type="dxa"/>
+              <w:bottom w:w="120" w:type="dxa"/>
+              <w:right w:w="120" w:type="dxa"/>
+            </w:tcMar>
+          </w:tcPr>
+          <w:p>
+            <w:pPr>
+              <w:jc w:val="left"/>
+            </w:pPr>
+            <w:r>
+              <w:rPr/>
+              <w:drawing>
+                <wp:inline>
+                  <wp:extent cx="1005840" cy="1005840"/>
+                  <wp:effectExtent b="0" l="0" r="0" t="0"/>
+                  <wp:docPr descr="Code QR de la vidéo" title="" id="107" name="Picture"/>
+                  <a:graphic>
+                    <a:graphicData uri="http://schemas.openxmlformats.org/drawingml/2006/picture">
+                      <pic:pic>
+                        <pic:nvPicPr>
+                          <pic:cNvPr descr="/tmp/tmp6ohqn6ia/qr-15.png" id="108" name="Picture"/>
+                          <pic:cNvPicPr>
+                            <a:picLocks noChangeArrowheads="1" noChangeAspect="1"/>
+                          </pic:cNvPicPr>
+                        </pic:nvPicPr>
+                        <pic:blipFill>
+                          <a:blip r:embed="rId106"/>
+                          <a:stretch>
+                            <a:fillRect/>
+                          </a:stretch>
+                        </pic:blipFill>
+                        <pic:spPr bwMode="auto">
+                          <a:xfrm>
+                            <a:off x="0" y="0"/>
+                            <a:ext cx="1005840" cy="1005840"/>
+                          </a:xfrm>
+                          <a:prstGeom prst="rect">
+                            <a:avLst/>
+                          </a:prstGeom>
+                          <a:noFill/>
+                          <a:ln w="9525">
+                            <a:noFill/>
+                            <a:headEnd/>
+                            <a:tailEnd/>
+                          </a:ln>
+                        </pic:spPr>
+                      </pic:pic>
+                    </a:graphicData>
+                  </a:graphic>
+                </wp:inline>
+              </w:drawing>
+            </w:r>
+          </w:p>
+        </w:tc>
+        <w:tc>
+          <w:tcPr>
+            <w:tcW w:w="7400" w:type="dxa"/>
+            <w:vAlign w:val="center"/>
+          </w:tcPr>
+          <w:p>
+            <w:pPr>
+              <w:jc w:val="left"/>
+            </w:pPr>
+            <w:r>
+              <w:rPr>
+                <w:bCs/>
+                <w:b/>
+              </w:rPr>
+              <w:t xml:space="preserve">▶ Vidéo : Résumé</w:t>
+            </w:r>
+          </w:p>
+          <w:p>
+            <w:pPr>
+              <w:jc w:val="left"/>
+            </w:pPr>
+            <w:r>
+              <w:t xml:space="preserve">La vidéo ne peut pas jouer dans le document Word. Scanne le code avec une tablette ou un téléphone, ou clique sur le lien :</w:t>
+            </w:r>
+          </w:p>
+          <w:p>
+            <w:pPr>
+              <w:jc w:val="left"/>
+            </w:pPr>
+            <w:hyperlink r:id="rId109">
+              <w:r>
+                <w:rPr>
+                  <w:rStyle w:val="Hyperlink"/>
+                </w:rPr>
+                <w:t xml:space="preserve">https://cdn.jsdelivr.net/gh/sckurosaki/lachutelibre@main/video/video-7.mp4</w:t>
+              </w:r>
+            </w:hyperlink>
+          </w:p>
+        </w:tc>
+      </w:tr>
+    </w:tbl>
+    <w:p/>
     <w:p>
       <w:pPr>
-        <w:pStyle w:val="BodyText"/>
-      </w:pPr>
-      <w:r>
-        <w:t xml:space="preserve">▶ Vidéo :</w:t>
-      </w:r>
-      <w:r>
-        <w:t xml:space="preserve"> </w:t>
-      </w:r>
-      <w:hyperlink r:id="rId85">
-        <w:r>
-          <w:rPr>
-            <w:rStyle w:val="Hyperlink"/>
-          </w:rPr>
-          <w:t xml:space="preserve">regarder la vidéo en ligne</w:t>
-        </w:r>
-      </w:hyperlink>
-    </w:p>
-    <w:p>
-      <w:pPr>
-        <w:pStyle w:val="BodyText"/>
+        <w:pStyle w:val="Credit"/>
       </w:pPr>
       <w:r>
         <w:t xml:space="preserve">Crédit : Créer par Anthropic, Claude IA</w:t>
@@ -7160,18 +7982,18 @@
           <wp:inline>
             <wp:extent cx="1866900" cy="3397985"/>
             <wp:effectExtent b="0" l="0" r="0" t="0"/>
-            <wp:docPr descr="La balle descend de plus en plus vite." title="" id="87" name="Picture"/>
+            <wp:docPr descr="La balle descend de plus en plus vite." title="" id="111" name="Picture"/>
             <a:graphic>
               <a:graphicData uri="http://schemas.openxmlformats.org/drawingml/2006/picture">
                 <pic:pic>
                   <pic:nvPicPr>
-                    <pic:cNvPr descr="/home/claude/lachutelibre/image/image-9.png" id="88" name="Picture"/>
+                    <pic:cNvPr descr="/home/claude/lachutelibre/image/image-9.png" id="112" name="Picture"/>
                     <pic:cNvPicPr>
                       <a:picLocks noChangeArrowheads="1" noChangeAspect="1"/>
                     </pic:cNvPicPr>
                   </pic:nvPicPr>
                   <pic:blipFill>
-                    <a:blip r:embed="rId86"/>
+                    <a:blip r:embed="rId110"/>
                     <a:stretch>
                       <a:fillRect/>
                     </a:stretch>
@@ -7200,7 +8022,7 @@
     </w:p>
     <w:p>
       <w:pPr>
-        <w:pStyle w:val="BodyText"/>
+        <w:pStyle w:val="Credit"/>
       </w:pPr>
       <w:r>
         <w:t xml:space="preserve">Crédit : Illustration créée par Claude (IA), Anthropic.</w:t>
@@ -7287,8 +8109,8 @@
         <w:t xml:space="preserve">La seule force agissant sur la balle est la force gravitationnelle.</w:t>
       </w:r>
     </w:p>
-    <w:bookmarkEnd w:id="89"/>
-    <w:bookmarkStart w:id="111" w:name="p11"/>
+    <w:bookmarkEnd w:id="113"/>
+    <w:bookmarkStart w:id="135" w:name="p11"/>
     <w:p>
       <w:pPr>
         <w:pStyle w:val="Heading1"/>
@@ -7297,7 +8119,7 @@
         <w:t xml:space="preserve">Pratique autonome</w:t>
       </w:r>
     </w:p>
-    <w:bookmarkStart w:id="93" w:name="niveau-facile"/>
+    <w:bookmarkStart w:id="117" w:name="niveau-facile"/>
     <w:p>
       <w:pPr>
         <w:pStyle w:val="Heading2"/>
@@ -7306,7 +8128,7 @@
         <w:t xml:space="preserve">Niveau facile</w:t>
       </w:r>
     </w:p>
-    <w:bookmarkStart w:id="90" w:name="problème-1-1"/>
+    <w:bookmarkStart w:id="114" w:name="problème-1-1"/>
     <w:p>
       <w:pPr>
         <w:pStyle w:val="Heading3"/>
@@ -8069,8 +8891,8 @@
       </w:tr>
     </w:tbl>
     <w:p/>
-    <w:bookmarkEnd w:id="90"/>
-    <w:bookmarkStart w:id="91" w:name="problème-2-1"/>
+    <w:bookmarkEnd w:id="114"/>
+    <w:bookmarkStart w:id="115" w:name="problème-2-1"/>
     <w:p>
       <w:pPr>
         <w:pStyle w:val="Heading3"/>
@@ -8771,8 +9593,8 @@
       </w:tr>
     </w:tbl>
     <w:p/>
-    <w:bookmarkEnd w:id="91"/>
-    <w:bookmarkStart w:id="92" w:name="problème-3"/>
+    <w:bookmarkEnd w:id="115"/>
+    <w:bookmarkStart w:id="116" w:name="problème-3"/>
     <w:p>
       <w:pPr>
         <w:pStyle w:val="Heading3"/>
@@ -9743,9 +10565,9 @@
       </w:tr>
     </w:tbl>
     <w:p/>
-    <w:bookmarkEnd w:id="92"/>
-    <w:bookmarkEnd w:id="93"/>
-    <w:bookmarkStart w:id="103" w:name="niveau-moyen"/>
+    <w:bookmarkEnd w:id="116"/>
+    <w:bookmarkEnd w:id="117"/>
+    <w:bookmarkStart w:id="127" w:name="niveau-moyen"/>
     <w:p>
       <w:pPr>
         <w:pStyle w:val="Heading2"/>
@@ -9754,7 +10576,7 @@
         <w:t xml:space="preserve">Niveau moyen</w:t>
       </w:r>
     </w:p>
-    <w:bookmarkStart w:id="97" w:name="problème-4"/>
+    <w:bookmarkStart w:id="121" w:name="problème-4"/>
     <w:p>
       <w:pPr>
         <w:pStyle w:val="Heading3"/>
@@ -9780,18 +10602,18 @@
           <wp:inline>
             <wp:extent cx="3810000" cy="2540000"/>
             <wp:effectExtent b="0" l="0" r="0" t="0"/>
-            <wp:docPr descr="Alberta_Wheat_Pool_Grain_Elevators" title="" id="95" name="Picture"/>
+            <wp:docPr descr="Alberta_Wheat_Pool_Grain_Elevators" title="" id="119" name="Picture"/>
             <a:graphic>
               <a:graphicData uri="http://schemas.openxmlformats.org/drawingml/2006/picture">
                 <pic:pic>
                   <pic:nvPicPr>
-                    <pic:cNvPr descr="/home/claude/lachutelibre/image/image-10.jpg" id="96" name="Picture"/>
+                    <pic:cNvPr descr="/home/claude/lachutelibre/image/image-10.jpg" id="120" name="Picture"/>
                     <pic:cNvPicPr>
                       <a:picLocks noChangeArrowheads="1" noChangeAspect="1"/>
                     </pic:cNvPicPr>
                   </pic:nvPicPr>
                   <pic:blipFill>
-                    <a:blip r:embed="rId94"/>
+                    <a:blip r:embed="rId118"/>
                     <a:stretch>
                       <a:fillRect/>
                     </a:stretch>
@@ -9820,7 +10642,7 @@
     </w:p>
     <w:p>
       <w:pPr>
-        <w:pStyle w:val="BodyText"/>
+        <w:pStyle w:val="Credit"/>
       </w:pPr>
       <w:r>
         <w:t xml:space="preserve">Crédit : commons.wikimedia.org Voir la source</w:t>
@@ -10378,8 +11200,8 @@
       </w:tr>
     </w:tbl>
     <w:p/>
-    <w:bookmarkEnd w:id="97"/>
-    <w:bookmarkStart w:id="98" w:name="problème-5"/>
+    <w:bookmarkEnd w:id="121"/>
+    <w:bookmarkStart w:id="122" w:name="problème-5"/>
     <w:p>
       <w:pPr>
         <w:pStyle w:val="Heading3"/>
@@ -11133,8 +11955,8 @@
       </w:tr>
     </w:tbl>
     <w:p/>
-    <w:bookmarkEnd w:id="98"/>
-    <w:bookmarkStart w:id="102" w:name="problème-6"/>
+    <w:bookmarkEnd w:id="122"/>
+    <w:bookmarkStart w:id="126" w:name="problème-6"/>
     <w:p>
       <w:pPr>
         <w:pStyle w:val="Heading3"/>
@@ -11160,18 +11982,18 @@
           <wp:inline>
             <wp:extent cx="1333500" cy="889000"/>
             <wp:effectExtent b="0" l="0" r="0" t="0"/>
-            <wp:docPr descr="tour de Calgary" title="" id="100" name="Picture"/>
+            <wp:docPr descr="tour de Calgary" title="" id="124" name="Picture"/>
             <a:graphic>
               <a:graphicData uri="http://schemas.openxmlformats.org/drawingml/2006/picture">
                 <pic:pic>
                   <pic:nvPicPr>
-                    <pic:cNvPr descr="/home/claude/lachutelibre/image/image-11.jpg" id="101" name="Picture"/>
+                    <pic:cNvPr descr="/home/claude/lachutelibre/image/image-11.jpg" id="125" name="Picture"/>
                     <pic:cNvPicPr>
                       <a:picLocks noChangeArrowheads="1" noChangeAspect="1"/>
                     </pic:cNvPicPr>
                   </pic:nvPicPr>
                   <pic:blipFill>
-                    <a:blip r:embed="rId99"/>
+                    <a:blip r:embed="rId123"/>
                     <a:stretch>
                       <a:fillRect/>
                     </a:stretch>
@@ -11200,7 +12022,7 @@
     </w:p>
     <w:p>
       <w:pPr>
-        <w:pStyle w:val="BodyText"/>
+        <w:pStyle w:val="Credit"/>
       </w:pPr>
       <w:r>
         <w:t xml:space="preserve">Crédit : commons.wikimedia.org Voir la source</w:t>
@@ -11980,9 +12802,9 @@
       </w:tr>
     </w:tbl>
     <w:p/>
-    <w:bookmarkEnd w:id="102"/>
-    <w:bookmarkEnd w:id="103"/>
-    <w:bookmarkStart w:id="110" w:name="niveau-difficile"/>
+    <w:bookmarkEnd w:id="126"/>
+    <w:bookmarkEnd w:id="127"/>
+    <w:bookmarkStart w:id="134" w:name="niveau-difficile"/>
     <w:p>
       <w:pPr>
         <w:pStyle w:val="Heading2"/>
@@ -11991,7 +12813,7 @@
         <w:t xml:space="preserve">Niveau difficile</w:t>
       </w:r>
     </w:p>
-    <w:bookmarkStart w:id="104" w:name="problème-7"/>
+    <w:bookmarkStart w:id="128" w:name="problème-7"/>
     <w:p>
       <w:pPr>
         <w:pStyle w:val="Heading3"/>
@@ -12742,8 +13564,8 @@
       </w:tr>
     </w:tbl>
     <w:p/>
-    <w:bookmarkEnd w:id="104"/>
-    <w:bookmarkStart w:id="108" w:name="problème-8"/>
+    <w:bookmarkEnd w:id="128"/>
+    <w:bookmarkStart w:id="132" w:name="problème-8"/>
     <w:p>
       <w:pPr>
         <w:pStyle w:val="Heading3"/>
@@ -12769,18 +13591,18 @@
           <wp:inline>
             <wp:extent cx="3810000" cy="2540000"/>
             <wp:effectExtent b="0" l="0" r="0" t="0"/>
-            <wp:docPr descr="Edmonton_Streetcar_33_High_Level_Bridge" title="" id="106" name="Picture"/>
+            <wp:docPr descr="Edmonton_Streetcar_33_High_Level_Bridge" title="" id="130" name="Picture"/>
             <a:graphic>
               <a:graphicData uri="http://schemas.openxmlformats.org/drawingml/2006/picture">
                 <pic:pic>
                   <pic:nvPicPr>
-                    <pic:cNvPr descr="/home/claude/lachutelibre/image/image-12.jpg" id="107" name="Picture"/>
+                    <pic:cNvPr descr="/home/claude/lachutelibre/image/image-12.jpg" id="131" name="Picture"/>
                     <pic:cNvPicPr>
                       <a:picLocks noChangeArrowheads="1" noChangeAspect="1"/>
                     </pic:cNvPicPr>
                   </pic:nvPicPr>
                   <pic:blipFill>
-                    <a:blip r:embed="rId105"/>
+                    <a:blip r:embed="rId129"/>
                     <a:stretch>
                       <a:fillRect/>
                     </a:stretch>
@@ -12809,7 +13631,7 @@
     </w:p>
     <w:p>
       <w:pPr>
-        <w:pStyle w:val="BodyText"/>
+        <w:pStyle w:val="Credit"/>
       </w:pPr>
       <w:r>
         <w:t xml:space="preserve">Crédit : commons.wikimedia.org Voir la source</w:t>
@@ -13419,8 +14241,8 @@
       </w:tr>
     </w:tbl>
     <w:p/>
-    <w:bookmarkEnd w:id="108"/>
-    <w:bookmarkStart w:id="109" w:name="problème-9"/>
+    <w:bookmarkEnd w:id="132"/>
+    <w:bookmarkStart w:id="133" w:name="problème-9"/>
     <w:p>
       <w:pPr>
         <w:pStyle w:val="Heading3"/>
@@ -14192,10 +15014,10 @@
       </w:tr>
     </w:tbl>
     <w:p/>
-    <w:bookmarkEnd w:id="109"/>
-    <w:bookmarkEnd w:id="110"/>
-    <w:bookmarkEnd w:id="111"/>
-    <w:bookmarkStart w:id="112" w:name="p12"/>
+    <w:bookmarkEnd w:id="133"/>
+    <w:bookmarkEnd w:id="134"/>
+    <w:bookmarkEnd w:id="135"/>
+    <w:bookmarkStart w:id="136" w:name="p12"/>
     <w:p>
       <w:pPr>
         <w:pStyle w:val="Heading1"/>
@@ -14532,8 +15354,8 @@
         <w:t xml:space="preserve">Tes objectifs cochés sont sauvegardés uniquement dans ce navigateur.</w:t>
       </w:r>
     </w:p>
-    <w:bookmarkEnd w:id="112"/>
-    <w:bookmarkStart w:id="128" w:name="p13"/>
+    <w:bookmarkEnd w:id="136"/>
+    <w:bookmarkStart w:id="152" w:name="p13"/>
     <w:p>
       <w:pPr>
         <w:pStyle w:val="Heading1"/>
@@ -14622,7 +15444,7 @@
         <w:t xml:space="preserve"> sur la Terre, sauf indication contraire.</w:t>
       </w:r>
     </w:p>
-    <w:bookmarkStart w:id="113" w:name="rev-q1"/>
+    <w:bookmarkStart w:id="137" w:name="rev-q1"/>
     <w:p>
       <w:pPr>
         <w:pStyle w:val="Heading3"/>
@@ -15182,8 +16004,8 @@
       </w:tr>
     </w:tbl>
     <w:p/>
-    <w:bookmarkEnd w:id="113"/>
-    <w:bookmarkStart w:id="114" w:name="rev-q2"/>
+    <w:bookmarkEnd w:id="137"/>
+    <w:bookmarkStart w:id="138" w:name="rev-q2"/>
     <w:p>
       <w:pPr>
         <w:pStyle w:val="Heading3"/>
@@ -16044,8 +16866,8 @@
       </w:tr>
     </w:tbl>
     <w:p/>
-    <w:bookmarkEnd w:id="114"/>
-    <w:bookmarkStart w:id="115" w:name="rev-q3"/>
+    <w:bookmarkEnd w:id="138"/>
+    <w:bookmarkStart w:id="139" w:name="rev-q3"/>
     <w:p>
       <w:pPr>
         <w:pStyle w:val="Heading3"/>
@@ -16348,8 +17170,8 @@
       </w:tr>
     </w:tbl>
     <w:p/>
-    <w:bookmarkEnd w:id="115"/>
-    <w:bookmarkStart w:id="116" w:name="rev-q4"/>
+    <w:bookmarkEnd w:id="139"/>
+    <w:bookmarkStart w:id="140" w:name="rev-q4"/>
     <w:p>
       <w:pPr>
         <w:pStyle w:val="Heading3"/>
@@ -16530,8 +17352,8 @@
       </w:tr>
     </w:tbl>
     <w:p/>
-    <w:bookmarkEnd w:id="116"/>
-    <w:bookmarkStart w:id="117" w:name="rev-q5"/>
+    <w:bookmarkEnd w:id="140"/>
+    <w:bookmarkStart w:id="141" w:name="rev-q5"/>
     <w:p>
       <w:pPr>
         <w:pStyle w:val="Heading3"/>
@@ -17798,8 +18620,8 @@
       </w:tr>
     </w:tbl>
     <w:p/>
-    <w:bookmarkEnd w:id="117"/>
-    <w:bookmarkStart w:id="121" w:name="rev-q6"/>
+    <w:bookmarkEnd w:id="141"/>
+    <w:bookmarkStart w:id="145" w:name="rev-q6"/>
     <w:p>
       <w:pPr>
         <w:pStyle w:val="Heading3"/>
@@ -17825,18 +18647,18 @@
           <wp:inline>
             <wp:extent cx="3810000" cy="2540000"/>
             <wp:effectExtent b="0" l="0" r="0" t="0"/>
-            <wp:docPr descr="Canyon Maligne" title="" id="119" name="Picture"/>
+            <wp:docPr descr="Canyon Maligne" title="" id="143" name="Picture"/>
             <a:graphic>
               <a:graphicData uri="http://schemas.openxmlformats.org/drawingml/2006/picture">
                 <pic:pic>
                   <pic:nvPicPr>
-                    <pic:cNvPr descr="/home/claude/lachutelibre/image/image-13.jpg" id="120" name="Picture"/>
+                    <pic:cNvPr descr="/home/claude/lachutelibre/image/image-13.jpg" id="144" name="Picture"/>
                     <pic:cNvPicPr>
                       <a:picLocks noChangeArrowheads="1" noChangeAspect="1"/>
                     </pic:cNvPicPr>
                   </pic:nvPicPr>
                   <pic:blipFill>
-                    <a:blip r:embed="rId118"/>
+                    <a:blip r:embed="rId142"/>
                     <a:stretch>
                       <a:fillRect/>
                     </a:stretch>
@@ -17865,7 +18687,7 @@
     </w:p>
     <w:p>
       <w:pPr>
-        <w:pStyle w:val="BodyText"/>
+        <w:pStyle w:val="Credit"/>
       </w:pPr>
       <w:r>
         <w:t xml:space="preserve">Crédit : commons.wikimedia.org Voir la source</w:t>
@@ -18640,8 +19462,8 @@
       </w:tr>
     </w:tbl>
     <w:p/>
-    <w:bookmarkEnd w:id="121"/>
-    <w:bookmarkStart w:id="122" w:name="rev-q7"/>
+    <w:bookmarkEnd w:id="145"/>
+    <w:bookmarkStart w:id="146" w:name="rev-q7"/>
     <w:p>
       <w:pPr>
         <w:pStyle w:val="Heading3"/>
@@ -19676,8 +20498,8 @@
       </w:tr>
     </w:tbl>
     <w:p/>
-    <w:bookmarkEnd w:id="122"/>
-    <w:bookmarkStart w:id="123" w:name="rev-q9"/>
+    <w:bookmarkEnd w:id="146"/>
+    <w:bookmarkStart w:id="147" w:name="rev-q9"/>
     <w:p>
       <w:pPr>
         <w:pStyle w:val="Heading3"/>
@@ -20857,8 +21679,8 @@
       </w:tr>
     </w:tbl>
     <w:p/>
-    <w:bookmarkEnd w:id="123"/>
-    <w:bookmarkStart w:id="127" w:name="rev-q10"/>
+    <w:bookmarkEnd w:id="147"/>
+    <w:bookmarkStart w:id="151" w:name="rev-q10"/>
     <w:p>
       <w:pPr>
         <w:pStyle w:val="Heading3"/>
@@ -20884,18 +21706,18 @@
           <wp:inline>
             <wp:extent cx="3733800" cy="2800350"/>
             <wp:effectExtent b="0" l="0" r="0" t="0"/>
-            <wp:docPr descr="Grotte Rats Nest" title="" id="125" name="Picture"/>
+            <wp:docPr descr="Grotte Rats Nest" title="" id="149" name="Picture"/>
             <a:graphic>
               <a:graphicData uri="http://schemas.openxmlformats.org/drawingml/2006/picture">
                 <pic:pic>
                   <pic:nvPicPr>
-                    <pic:cNvPr descr="/home/claude/lachutelibre/image/image-14.jpg" id="126" name="Picture"/>
+                    <pic:cNvPr descr="/home/claude/lachutelibre/image/image-14.jpg" id="150" name="Picture"/>
                     <pic:cNvPicPr>
                       <a:picLocks noChangeArrowheads="1" noChangeAspect="1"/>
                     </pic:cNvPicPr>
                   </pic:nvPicPr>
                   <pic:blipFill>
-                    <a:blip r:embed="rId124"/>
+                    <a:blip r:embed="rId148"/>
                     <a:stretch>
                       <a:fillRect/>
                     </a:stretch>
@@ -20924,7 +21746,7 @@
     </w:p>
     <w:p>
       <w:pPr>
-        <w:pStyle w:val="BodyText"/>
+        <w:pStyle w:val="Credit"/>
       </w:pPr>
       <w:r>
         <w:t xml:space="preserve">Crédit : commons.wikimedia.org Voir la source</w:t>
@@ -22133,8 +22955,8 @@
         </w:r>
       </w:hyperlink>
     </w:p>
-    <w:bookmarkEnd w:id="127"/>
-    <w:bookmarkEnd w:id="128"/>
+    <w:bookmarkEnd w:id="151"/>
+    <w:bookmarkEnd w:id="152"/>
     <w:sectPr/>
   </w:body>
 </w:document>

</xml_diff>